<commit_message>
nmv 12 08 2026
</commit_message>
<xml_diff>
--- a/TS Jatai Ghanam Project/TS 2.6/TS 2.6 Jatai Malayalam Corrections.docx
+++ b/TS Jatai Ghanam Project/TS 2.6/TS 2.6 Jatai Malayalam Corrections.docx
@@ -1,6 +1,6 @@
 
 <file path=word/document.xml><?xml version="1.0" encoding="utf-8"?>
-<w:document xmlns:wpc="http://schemas.microsoft.com/office/word/2010/wordprocessingCanvas" xmlns:cx="http://schemas.microsoft.com/office/drawing/2014/chartex" xmlns:cx1="http://schemas.microsoft.com/office/drawing/2015/9/8/chartex" xmlns:cx2="http://schemas.microsoft.com/office/drawing/2015/10/21/chartex" xmlns:cx3="http://schemas.microsoft.com/office/drawing/2016/5/9/chartex" xmlns:cx4="http://schemas.microsoft.com/office/drawing/2016/5/10/chartex" xmlns:cx5="http://schemas.microsoft.com/office/drawing/2016/5/11/chartex" xmlns:cx6="http://schemas.microsoft.com/office/drawing/2016/5/12/chartex" xmlns:cx7="http://schemas.microsoft.com/office/drawing/2016/5/13/chartex" xmlns:cx8="http://schemas.microsoft.com/office/drawing/2016/5/14/chartex" xmlns:mc="http://schemas.openxmlformats.org/markup-compatibility/2006" xmlns:aink="http://schemas.microsoft.com/office/drawing/2016/ink" xmlns:am3d="http://schemas.microsoft.com/office/drawing/2017/model3d" xmlns:o="urn:schemas-microsoft-com:office:office" xmlns:oel="http://schemas.microsoft.com/office/2019/extlst" xmlns:r="http://schemas.openxmlformats.org/officeDocument/2006/relationships" xmlns:m="http://schemas.openxmlformats.org/officeDocument/2006/math" xmlns:v="urn:schemas-microsoft-com:vml" xmlns:wp14="http://schemas.microsoft.com/office/word/2010/wordprocessingDrawing" xmlns:wp="http://schemas.openxmlformats.org/drawingml/2006/wordprocessingDrawing" xmlns:w10="urn:schemas-microsoft-com:office:word" xmlns:w="http://schemas.openxmlformats.org/wordprocessingml/2006/main" xmlns:w14="http://schemas.microsoft.com/office/word/2010/wordml" xmlns:w15="http://schemas.microsoft.com/office/word/2012/wordml" xmlns:w16cex="http://schemas.microsoft.com/office/word/2018/wordml/cex" xmlns:w16cid="http://schemas.microsoft.com/office/word/2016/wordml/cid" xmlns:w16="http://schemas.microsoft.com/office/word/2018/wordml" xmlns:w16du="http://schemas.microsoft.com/office/word/2023/wordml/word16du" xmlns:w16sdtdh="http://schemas.microsoft.com/office/word/2020/wordml/sdtdatahash" xmlns:w16sdtfl="http://schemas.microsoft.com/office/word/2024/wordml/sdtformatlock" xmlns:w16se="http://schemas.microsoft.com/office/word/2015/wordml/symex" xmlns:wpg="http://schemas.microsoft.com/office/word/2010/wordprocessingGroup" xmlns:wpi="http://schemas.microsoft.com/office/word/2010/wordprocessingInk" xmlns:wne="http://schemas.microsoft.com/office/word/2006/wordml" xmlns:wps="http://schemas.microsoft.com/office/word/2010/wordprocessingShape" mc:Ignorable="w14 w15 w16se w16cid w16 w16cex w16sdtdh w16sdtfl w16du wp14">
+<w:document xmlns:wpc="http://schemas.microsoft.com/office/word/2010/wordprocessingCanvas" xmlns:cx="http://schemas.microsoft.com/office/drawing/2014/chartex" xmlns:cx1="http://schemas.microsoft.com/office/drawing/2015/9/8/chartex" xmlns:cx2="http://schemas.microsoft.com/office/drawing/2015/10/21/chartex" xmlns:cx3="http://schemas.microsoft.com/office/drawing/2016/5/9/chartex" xmlns:cx4="http://schemas.microsoft.com/office/drawing/2016/5/10/chartex" xmlns:cx5="http://schemas.microsoft.com/office/drawing/2016/5/11/chartex" xmlns:cx6="http://schemas.microsoft.com/office/drawing/2016/5/12/chartex" xmlns:cx7="http://schemas.microsoft.com/office/drawing/2016/5/13/chartex" xmlns:cx8="http://schemas.microsoft.com/office/drawing/2016/5/14/chartex" xmlns:mc="http://schemas.openxmlformats.org/markup-compatibility/2006" xmlns:aink="http://schemas.microsoft.com/office/drawing/2016/ink" xmlns:am3d="http://schemas.microsoft.com/office/drawing/2017/model3d" xmlns:o="urn:schemas-microsoft-com:office:office" xmlns:oel="http://schemas.microsoft.com/office/2019/extlst" xmlns:r="http://schemas.openxmlformats.org/officeDocument/2006/relationships" xmlns:m="http://schemas.openxmlformats.org/officeDocument/2006/math" xmlns:v="urn:schemas-microsoft-com:vml" xmlns:wp14="http://schemas.microsoft.com/office/word/2010/wordprocessingDrawing" xmlns:wp="http://schemas.openxmlformats.org/drawingml/2006/wordprocessingDrawing" xmlns:w10="urn:schemas-microsoft-com:office:word" xmlns:w="http://schemas.openxmlformats.org/wordprocessingml/2006/main" xmlns:w14="http://schemas.microsoft.com/office/word/2010/wordml" xmlns:w15="http://schemas.microsoft.com/office/word/2012/wordml" xmlns:w16cei="http://schemas.microsoft.com/office/word/2026/wordml/cei" xmlns:w16cex="http://schemas.microsoft.com/office/word/2018/wordml/cex" xmlns:w16cid="http://schemas.microsoft.com/office/word/2016/wordml/cid" xmlns:w16="http://schemas.microsoft.com/office/word/2018/wordml" xmlns:w16du="http://schemas.microsoft.com/office/word/2023/wordml/word16du" xmlns:w16sdtdh="http://schemas.microsoft.com/office/word/2020/wordml/sdtdatahash" xmlns:w16sdtfl="http://schemas.microsoft.com/office/word/2024/wordml/sdtformatlock" xmlns:w16se="http://schemas.microsoft.com/office/word/2015/wordml/symex" xmlns:wpg="http://schemas.microsoft.com/office/word/2010/wordprocessingGroup" xmlns:wpi="http://schemas.microsoft.com/office/word/2010/wordprocessingInk" xmlns:wne="http://schemas.microsoft.com/office/word/2006/wordml" xmlns:wps="http://schemas.microsoft.com/office/word/2010/wordprocessingShape" mc:Ignorable="w14 w15 w16se w16cid w16 w16cex w16sdtdh w16sdtfl w16du wp14">
   <w:body>
     <w:p>
       <w:pPr>
@@ -112,9 +112,8 @@
           <w:szCs w:val="32"/>
           <w:u w:val="single"/>
         </w:rPr>
-        <w:t xml:space="preserve">Observed </w:t>
+        <w:t xml:space="preserve">Observed till </w:t>
       </w:r>
-      <w:proofErr w:type="gramStart"/>
       <w:r>
         <w:rPr>
           <w:b/>
@@ -123,20 +122,8 @@
           <w:szCs w:val="32"/>
           <w:u w:val="single"/>
         </w:rPr>
-        <w:t xml:space="preserve">till </w:t>
+        <w:t>31st July 2026</w:t>
       </w:r>
-      <w:r>
-        <w:rPr>
-          <w:b/>
-          <w:bCs/>
-          <w:sz w:val="32"/>
-          <w:szCs w:val="32"/>
-          <w:highlight w:val="red"/>
-          <w:u w:val="single"/>
-        </w:rPr>
-        <w:t>?????</w:t>
-      </w:r>
-      <w:proofErr w:type="gramEnd"/>
     </w:p>
     <w:p>
       <w:pPr>
@@ -367,27 +354,7 @@
                 <w:sz w:val="32"/>
                 <w:szCs w:val="40"/>
               </w:rPr>
-              <w:t>)</w:t>
-            </w:r>
-            <w:proofErr w:type="gramStart"/>
-            <w:r>
-              <w:rPr>
-                <w:rFonts w:ascii="BRH Malayalam Extra" w:hAnsi="BRH Malayalam Extra" w:cs="BRH Malayalam Extra"/>
-                <w:color w:val="000000"/>
-                <w:sz w:val="32"/>
-                <w:szCs w:val="40"/>
-              </w:rPr>
-              <w:t>-  jZ</w:t>
-            </w:r>
-            <w:proofErr w:type="gramEnd"/>
-            <w:r>
-              <w:rPr>
-                <w:rFonts w:ascii="BRH Malayalam Extra" w:hAnsi="BRH Malayalam Extra" w:cs="BRH Malayalam Extra"/>
-                <w:color w:val="000000"/>
-                <w:sz w:val="32"/>
-                <w:szCs w:val="40"/>
-              </w:rPr>
-              <w:t>§ | ög¢</w:t>
+              <w:t>)-  jZ§ | ög¢</w:t>
             </w:r>
             <w:r>
               <w:rPr>
@@ -651,27 +618,7 @@
                 <w:sz w:val="32"/>
                 <w:szCs w:val="40"/>
               </w:rPr>
-              <w:t>)</w:t>
-            </w:r>
-            <w:proofErr w:type="gramStart"/>
-            <w:r>
-              <w:rPr>
-                <w:rFonts w:ascii="BRH Malayalam Extra" w:hAnsi="BRH Malayalam Extra" w:cs="BRH Malayalam Extra"/>
-                <w:color w:val="000000"/>
-                <w:sz w:val="32"/>
-                <w:szCs w:val="40"/>
-              </w:rPr>
-              <w:t>-  ög</w:t>
-            </w:r>
-            <w:proofErr w:type="gramEnd"/>
-            <w:r>
-              <w:rPr>
-                <w:rFonts w:ascii="BRH Malayalam Extra" w:hAnsi="BRH Malayalam Extra" w:cs="BRH Malayalam Extra"/>
-                <w:color w:val="000000"/>
-                <w:sz w:val="32"/>
-                <w:szCs w:val="40"/>
-              </w:rPr>
-              <w:t>¢</w:t>
+              <w:t>)-  ög¢</w:t>
             </w:r>
             <w:r>
               <w:rPr>
@@ -945,27 +892,7 @@
                 <w:sz w:val="32"/>
                 <w:szCs w:val="40"/>
               </w:rPr>
-              <w:t>)</w:t>
-            </w:r>
-            <w:proofErr w:type="gramStart"/>
-            <w:r>
-              <w:rPr>
-                <w:rFonts w:ascii="BRH Malayalam Extra" w:hAnsi="BRH Malayalam Extra" w:cs="BRH Malayalam Extra"/>
-                <w:color w:val="000000"/>
-                <w:sz w:val="32"/>
-                <w:szCs w:val="40"/>
-              </w:rPr>
-              <w:t>-  jZ</w:t>
-            </w:r>
-            <w:proofErr w:type="gramEnd"/>
-            <w:r>
-              <w:rPr>
-                <w:rFonts w:ascii="BRH Malayalam Extra" w:hAnsi="BRH Malayalam Extra" w:cs="BRH Malayalam Extra"/>
-                <w:color w:val="000000"/>
-                <w:sz w:val="32"/>
-                <w:szCs w:val="40"/>
-              </w:rPr>
-              <w:t>§ | ög¢</w:t>
+              <w:t>)-  jZ§ | ög¢</w:t>
             </w:r>
             <w:r>
               <w:rPr>
@@ -1259,27 +1186,7 @@
                 <w:sz w:val="32"/>
                 <w:szCs w:val="40"/>
               </w:rPr>
-              <w:t>)</w:t>
-            </w:r>
-            <w:proofErr w:type="gramStart"/>
-            <w:r>
-              <w:rPr>
-                <w:rFonts w:ascii="BRH Malayalam Extra" w:hAnsi="BRH Malayalam Extra" w:cs="BRH Malayalam Extra"/>
-                <w:color w:val="000000"/>
-                <w:sz w:val="32"/>
-                <w:szCs w:val="40"/>
-              </w:rPr>
-              <w:t>-  ög</w:t>
-            </w:r>
-            <w:proofErr w:type="gramEnd"/>
-            <w:r>
-              <w:rPr>
-                <w:rFonts w:ascii="BRH Malayalam Extra" w:hAnsi="BRH Malayalam Extra" w:cs="BRH Malayalam Extra"/>
-                <w:color w:val="000000"/>
-                <w:sz w:val="32"/>
-                <w:szCs w:val="40"/>
-              </w:rPr>
-              <w:t>¢</w:t>
+              <w:t>)-  ög¢</w:t>
             </w:r>
             <w:r>
               <w:rPr>
@@ -1577,19 +1484,8 @@
                 <w:sz w:val="32"/>
                 <w:szCs w:val="40"/>
               </w:rPr>
-              <w:t>)</w:t>
-            </w:r>
-            <w:proofErr w:type="gramStart"/>
-            <w:r>
-              <w:rPr>
-                <w:rFonts w:ascii="BRH Malayalam Extra" w:hAnsi="BRH Malayalam Extra" w:cs="BRH Malayalam Extra"/>
-                <w:color w:val="000000"/>
-                <w:sz w:val="32"/>
-                <w:szCs w:val="40"/>
-              </w:rPr>
-              <w:t>-  g</w:t>
-            </w:r>
-            <w:proofErr w:type="gramEnd"/>
+              <w:t>)-  g</w:t>
+            </w:r>
             <w:r>
               <w:rPr>
                 <w:rFonts w:ascii="BRH Malayalam Extra" w:hAnsi="BRH Malayalam Extra" w:cs="BRH Malayalam Extra"/>
@@ -1608,7 +1504,6 @@
               </w:rPr>
               <w:t>ª</w:t>
             </w:r>
-            <w:proofErr w:type="gramStart"/>
             <w:r>
               <w:rPr>
                 <w:rFonts w:ascii="BRH Malayalam Extra" w:hAnsi="BRH Malayalam Extra" w:cs="BRH Malayalam Extra"/>
@@ -1627,7 +1522,6 @@
               </w:rPr>
               <w:t>.ty</w:t>
             </w:r>
-            <w:proofErr w:type="gramEnd"/>
             <w:r>
               <w:rPr>
                 <w:rFonts w:ascii="BRH Malayalam Extra" w:hAnsi="BRH Malayalam Extra" w:cs="BRH Malayalam Extra"/>
@@ -1655,9 +1549,7 @@
               <w:adjustRightInd w:val="0"/>
               <w:spacing w:line="240" w:lineRule="auto"/>
               <w:rPr>
-                <w:rFonts w:ascii="BRH Malayalam Extra" w:hAnsi="BRH Malayalam Extra" w:cs="BRH Malayalam Extra"/>
-                <w:color w:val="000000"/>
-                <w:sz w:val="32"/>
+                <w:rFonts w:cs="BRH Malayalam Extra"/>
                 <w:szCs w:val="40"/>
               </w:rPr>
             </w:pPr>
@@ -1688,7 +1580,6 @@
               </w:rPr>
               <w:t>ª</w:t>
             </w:r>
-            <w:proofErr w:type="gramStart"/>
             <w:r>
               <w:rPr>
                 <w:rFonts w:ascii="BRH Malayalam Extra" w:hAnsi="BRH Malayalam Extra" w:cs="BRH Malayalam Extra"/>
@@ -1707,7 +1598,6 @@
               </w:rPr>
               <w:t>.ty</w:t>
             </w:r>
-            <w:proofErr w:type="gramEnd"/>
             <w:r>
               <w:rPr>
                 <w:rFonts w:ascii="BRH Malayalam Extra" w:hAnsi="BRH Malayalam Extra" w:cs="BRH Malayalam Extra"/>
@@ -1744,7 +1634,6 @@
               </w:rPr>
               <w:t xml:space="preserve"> ¥j ¥j g—</w:t>
             </w:r>
-            <w:proofErr w:type="gramStart"/>
             <w:r>
               <w:rPr>
                 <w:rFonts w:ascii="BRH Malayalam Extra" w:hAnsi="BRH Malayalam Extra" w:cs="BRH Malayalam Extra"/>
@@ -1764,36 +1653,24 @@
               </w:rPr>
               <w:t>.ty</w:t>
             </w:r>
-            <w:proofErr w:type="gramEnd"/>
-            <w:r>
-              <w:rPr>
-                <w:rFonts w:ascii="BRH Malayalam Extra" w:hAnsi="BRH Malayalam Extra" w:cs="BRH Malayalam Extra"/>
-                <w:color w:val="000000"/>
-                <w:sz w:val="26"/>
-                <w:szCs w:val="40"/>
-              </w:rPr>
-              <w:t>–</w:t>
-            </w:r>
-            <w:r>
-              <w:rPr>
-                <w:rFonts w:ascii="BRH Malayalam Extra" w:hAnsi="BRH Malayalam Extra" w:cs="BRH Malayalam Extra"/>
-                <w:color w:val="000000"/>
-                <w:sz w:val="32"/>
-                <w:szCs w:val="40"/>
-              </w:rPr>
-              <w:t xml:space="preserve">r¥bx— </w:t>
-            </w:r>
-            <w:proofErr w:type="gramStart"/>
-            <w:r>
-              <w:rPr>
-                <w:rFonts w:ascii="BRH Malayalam Extra" w:hAnsi="BRH Malayalam Extra" w:cs="BRH Malayalam Extra"/>
-                <w:color w:val="000000"/>
-                <w:sz w:val="32"/>
-                <w:szCs w:val="40"/>
-              </w:rPr>
-              <w:t>gª.ty</w:t>
-            </w:r>
-            <w:proofErr w:type="gramEnd"/>
+            <w:r>
+              <w:rPr>
+                <w:rFonts w:ascii="BRH Malayalam Extra" w:hAnsi="BRH Malayalam Extra" w:cs="BRH Malayalam Extra"/>
+                <w:color w:val="000000"/>
+                <w:sz w:val="26"/>
+                <w:szCs w:val="40"/>
+              </w:rPr>
+              <w:t>–</w:t>
+            </w:r>
+            <w:r>
+              <w:rPr>
+                <w:rFonts w:ascii="BRH Malayalam Extra" w:hAnsi="BRH Malayalam Extra" w:cs="BRH Malayalam Extra"/>
+                <w:color w:val="000000"/>
+                <w:sz w:val="32"/>
+                <w:szCs w:val="40"/>
+              </w:rPr>
+              <w:t>r¥bx— gª.ty</w:t>
+            </w:r>
             <w:r>
               <w:rPr>
                 <w:rFonts w:ascii="BRH Malayalam Extra" w:hAnsi="BRH Malayalam Extra" w:cs="BRH Malayalam Extra"/>
@@ -1830,19 +1707,6 @@
               </w:rPr>
               <w:t xml:space="preserve"> ¥j | </w:t>
             </w:r>
-          </w:p>
-          <w:p>
-            <w:pPr>
-              <w:widowControl w:val="0"/>
-              <w:autoSpaceDE w:val="0"/>
-              <w:autoSpaceDN w:val="0"/>
-              <w:adjustRightInd w:val="0"/>
-              <w:spacing w:before="0" w:line="240" w:lineRule="auto"/>
-              <w:rPr>
-                <w:rFonts w:cs="BRH Malayalam Extra"/>
-                <w:szCs w:val="40"/>
-              </w:rPr>
-            </w:pPr>
           </w:p>
         </w:tc>
         <w:tc>
@@ -1972,19 +1836,8 @@
                 <w:sz w:val="32"/>
                 <w:szCs w:val="40"/>
               </w:rPr>
-              <w:t>)</w:t>
-            </w:r>
-            <w:proofErr w:type="gramStart"/>
-            <w:r>
-              <w:rPr>
-                <w:rFonts w:ascii="BRH Malayalam Extra" w:hAnsi="BRH Malayalam Extra" w:cs="BRH Malayalam Extra"/>
-                <w:color w:val="000000"/>
-                <w:sz w:val="32"/>
-                <w:szCs w:val="40"/>
-              </w:rPr>
-              <w:t>-  g</w:t>
-            </w:r>
-            <w:proofErr w:type="gramEnd"/>
+              <w:t>)-  g</w:t>
+            </w:r>
             <w:r>
               <w:rPr>
                 <w:rFonts w:ascii="BRH Malayalam Extra" w:hAnsi="BRH Malayalam Extra" w:cs="BRH Malayalam Extra"/>
@@ -2003,7 +1856,6 @@
               </w:rPr>
               <w:t>ª</w:t>
             </w:r>
-            <w:proofErr w:type="gramStart"/>
             <w:r>
               <w:rPr>
                 <w:rFonts w:ascii="BRH Malayalam Extra" w:hAnsi="BRH Malayalam Extra" w:cs="BRH Malayalam Extra"/>
@@ -2022,7 +1874,6 @@
               </w:rPr>
               <w:t>.ty</w:t>
             </w:r>
-            <w:proofErr w:type="gramEnd"/>
             <w:r>
               <w:rPr>
                 <w:rFonts w:ascii="BRH Malayalam Extra" w:hAnsi="BRH Malayalam Extra" w:cs="BRH Malayalam Extra"/>
@@ -2083,7 +1934,6 @@
               </w:rPr>
               <w:t>ª</w:t>
             </w:r>
-            <w:proofErr w:type="gramStart"/>
             <w:r>
               <w:rPr>
                 <w:rFonts w:ascii="BRH Malayalam Extra" w:hAnsi="BRH Malayalam Extra" w:cs="BRH Malayalam Extra"/>
@@ -2102,7 +1952,6 @@
               </w:rPr>
               <w:t>.ty</w:t>
             </w:r>
-            <w:proofErr w:type="gramEnd"/>
             <w:r>
               <w:rPr>
                 <w:rFonts w:ascii="BRH Malayalam Extra" w:hAnsi="BRH Malayalam Extra" w:cs="BRH Malayalam Extra"/>
@@ -2174,19 +2023,8 @@
                 <w:sz w:val="32"/>
                 <w:szCs w:val="40"/>
               </w:rPr>
-              <w:t xml:space="preserve">r¥bx— </w:t>
-            </w:r>
-            <w:proofErr w:type="gramStart"/>
-            <w:r>
-              <w:rPr>
-                <w:rFonts w:ascii="BRH Malayalam Extra" w:hAnsi="BRH Malayalam Extra" w:cs="BRH Malayalam Extra"/>
-                <w:color w:val="000000"/>
-                <w:sz w:val="32"/>
-                <w:szCs w:val="40"/>
-              </w:rPr>
-              <w:t>gª.ty</w:t>
-            </w:r>
-            <w:proofErr w:type="gramEnd"/>
+              <w:t>r¥bx— gª.ty</w:t>
+            </w:r>
             <w:r>
               <w:rPr>
                 <w:rFonts w:ascii="BRH Malayalam Extra" w:hAnsi="BRH Malayalam Extra" w:cs="BRH Malayalam Extra"/>
@@ -2303,6 +2141,16 @@
           <w:u w:val="single"/>
         </w:rPr>
       </w:pPr>
+      <w:r>
+        <w:rPr>
+          <w:b/>
+          <w:bCs/>
+          <w:sz w:val="32"/>
+          <w:szCs w:val="32"/>
+          <w:u w:val="single"/>
+        </w:rPr>
+        <w:t>===========</w:t>
+      </w:r>
     </w:p>
     <w:p>
       <w:pPr>
@@ -2679,27 +2527,7 @@
                 <w:sz w:val="32"/>
                 <w:szCs w:val="40"/>
               </w:rPr>
-              <w:t>)</w:t>
-            </w:r>
-            <w:proofErr w:type="gramStart"/>
-            <w:r>
-              <w:rPr>
-                <w:rFonts w:ascii="BRH Malayalam Extra" w:hAnsi="BRH Malayalam Extra" w:cs="BRH Malayalam Extra"/>
-                <w:color w:val="000000"/>
-                <w:sz w:val="32"/>
-                <w:szCs w:val="40"/>
-              </w:rPr>
-              <w:t>-  CZy</w:t>
-            </w:r>
-            <w:proofErr w:type="gramEnd"/>
-            <w:r>
-              <w:rPr>
-                <w:rFonts w:ascii="BRH Malayalam Extra" w:hAnsi="BRH Malayalam Extra" w:cs="BRH Malayalam Extra"/>
-                <w:color w:val="000000"/>
-                <w:sz w:val="32"/>
-                <w:szCs w:val="40"/>
-              </w:rPr>
-              <w:t>— | AsÜ—ËI |</w:t>
+              <w:t>)-  CZy— | AsÜ—ËI |</w:t>
             </w:r>
           </w:p>
           <w:p>
@@ -2898,27 +2726,7 @@
                 <w:sz w:val="32"/>
                 <w:szCs w:val="40"/>
               </w:rPr>
-              <w:t>)</w:t>
-            </w:r>
-            <w:proofErr w:type="gramStart"/>
-            <w:r>
-              <w:rPr>
-                <w:rFonts w:ascii="BRH Malayalam Extra" w:hAnsi="BRH Malayalam Extra" w:cs="BRH Malayalam Extra"/>
-                <w:color w:val="000000"/>
-                <w:sz w:val="32"/>
-                <w:szCs w:val="40"/>
-              </w:rPr>
-              <w:t>-  CZy</w:t>
-            </w:r>
-            <w:proofErr w:type="gramEnd"/>
-            <w:r>
-              <w:rPr>
-                <w:rFonts w:ascii="BRH Malayalam Extra" w:hAnsi="BRH Malayalam Extra" w:cs="BRH Malayalam Extra"/>
-                <w:color w:val="000000"/>
-                <w:sz w:val="32"/>
-                <w:szCs w:val="40"/>
-              </w:rPr>
-              <w:t>— | AsÜ—ËI |</w:t>
+              <w:t>)-  CZy— | AsÜ—ËI |</w:t>
             </w:r>
           </w:p>
           <w:p>
@@ -3123,19 +2931,8 @@
                 <w:sz w:val="32"/>
                 <w:szCs w:val="40"/>
               </w:rPr>
-              <w:t>)</w:t>
-            </w:r>
-            <w:proofErr w:type="gramStart"/>
-            <w:r>
-              <w:rPr>
-                <w:rFonts w:ascii="BRH Malayalam Extra" w:hAnsi="BRH Malayalam Extra" w:cs="BRH Malayalam Extra"/>
-                <w:color w:val="000000"/>
-                <w:sz w:val="32"/>
-                <w:szCs w:val="40"/>
-              </w:rPr>
-              <w:t>-  A</w:t>
-            </w:r>
-            <w:proofErr w:type="gramEnd"/>
+              <w:t>)-  A</w:t>
+            </w:r>
             <w:r>
               <w:rPr>
                 <w:rFonts w:ascii="BRH Malayalam Extra" w:hAnsi="BRH Malayalam Extra" w:cs="BRH Malayalam Extra"/>
@@ -3450,27 +3247,7 @@
                 <w:sz w:val="32"/>
                 <w:szCs w:val="40"/>
               </w:rPr>
-              <w:t>)</w:t>
-            </w:r>
-            <w:proofErr w:type="gramStart"/>
-            <w:r>
-              <w:rPr>
-                <w:rFonts w:ascii="BRH Malayalam Extra" w:hAnsi="BRH Malayalam Extra" w:cs="BRH Malayalam Extra"/>
-                <w:color w:val="000000"/>
-                <w:sz w:val="32"/>
-                <w:szCs w:val="40"/>
-              </w:rPr>
-              <w:t>-  BRõ</w:t>
-            </w:r>
-            <w:proofErr w:type="gramEnd"/>
-            <w:r>
-              <w:rPr>
-                <w:rFonts w:ascii="BRH Malayalam Extra" w:hAnsi="BRH Malayalam Extra" w:cs="BRH Malayalam Extra"/>
-                <w:color w:val="000000"/>
-                <w:sz w:val="32"/>
-                <w:szCs w:val="40"/>
-              </w:rPr>
-              <w:t>—hx</w:t>
+              <w:t>)-  BRõ—hx</w:t>
             </w:r>
             <w:r>
               <w:rPr>
@@ -3874,27 +3651,7 @@
                 <w:sz w:val="32"/>
                 <w:szCs w:val="40"/>
               </w:rPr>
-              <w:t>)</w:t>
-            </w:r>
-            <w:proofErr w:type="gramStart"/>
-            <w:r>
-              <w:rPr>
-                <w:rFonts w:ascii="BRH Malayalam Extra" w:hAnsi="BRH Malayalam Extra" w:cs="BRH Malayalam Extra"/>
-                <w:color w:val="000000"/>
-                <w:sz w:val="32"/>
-                <w:szCs w:val="40"/>
-              </w:rPr>
-              <w:t>-  BRõ</w:t>
-            </w:r>
-            <w:proofErr w:type="gramEnd"/>
-            <w:r>
-              <w:rPr>
-                <w:rFonts w:ascii="BRH Malayalam Extra" w:hAnsi="BRH Malayalam Extra" w:cs="BRH Malayalam Extra"/>
-                <w:color w:val="000000"/>
-                <w:sz w:val="32"/>
-                <w:szCs w:val="40"/>
-              </w:rPr>
-              <w:t>—hx</w:t>
+              <w:t>)-  BRõ—hx</w:t>
             </w:r>
             <w:r>
               <w:rPr>
@@ -4147,19 +3904,8 @@
                 <w:sz w:val="32"/>
                 <w:szCs w:val="40"/>
               </w:rPr>
-              <w:t>)</w:t>
-            </w:r>
-            <w:proofErr w:type="gramStart"/>
-            <w:r>
-              <w:rPr>
-                <w:rFonts w:ascii="BRH Malayalam Extra" w:hAnsi="BRH Malayalam Extra" w:cs="BRH Malayalam Extra"/>
-                <w:color w:val="000000"/>
-                <w:sz w:val="32"/>
-                <w:szCs w:val="40"/>
-              </w:rPr>
-              <w:t>-  A</w:t>
-            </w:r>
-            <w:proofErr w:type="gramEnd"/>
+              <w:t>)-  A</w:t>
+            </w:r>
             <w:r>
               <w:rPr>
                 <w:rFonts w:ascii="BRH Malayalam Extra" w:hAnsi="BRH Malayalam Extra" w:cs="BRH Malayalam Extra"/>
@@ -4470,27 +4216,7 @@
                 <w:sz w:val="32"/>
                 <w:szCs w:val="40"/>
               </w:rPr>
-              <w:t>)</w:t>
-            </w:r>
-            <w:proofErr w:type="gramStart"/>
-            <w:r>
-              <w:rPr>
-                <w:rFonts w:ascii="BRH Malayalam Extra" w:hAnsi="BRH Malayalam Extra" w:cs="BRH Malayalam Extra"/>
-                <w:color w:val="000000"/>
-                <w:sz w:val="32"/>
-                <w:szCs w:val="40"/>
-              </w:rPr>
-              <w:t>-  BRõ</w:t>
-            </w:r>
-            <w:proofErr w:type="gramEnd"/>
-            <w:r>
-              <w:rPr>
-                <w:rFonts w:ascii="BRH Malayalam Extra" w:hAnsi="BRH Malayalam Extra" w:cs="BRH Malayalam Extra"/>
-                <w:color w:val="000000"/>
-                <w:sz w:val="32"/>
-                <w:szCs w:val="40"/>
-              </w:rPr>
-              <w:t>—hx</w:t>
+              <w:t>)-  BRõ—hx</w:t>
             </w:r>
             <w:r>
               <w:rPr>
@@ -4843,27 +4569,7 @@
                 <w:sz w:val="32"/>
                 <w:szCs w:val="40"/>
               </w:rPr>
-              <w:t>)</w:t>
-            </w:r>
-            <w:proofErr w:type="gramStart"/>
-            <w:r>
-              <w:rPr>
-                <w:rFonts w:ascii="BRH Malayalam Extra" w:hAnsi="BRH Malayalam Extra" w:cs="BRH Malayalam Extra"/>
-                <w:color w:val="000000"/>
-                <w:sz w:val="32"/>
-                <w:szCs w:val="40"/>
-              </w:rPr>
-              <w:t>-  BRõ</w:t>
-            </w:r>
-            <w:proofErr w:type="gramEnd"/>
-            <w:r>
-              <w:rPr>
-                <w:rFonts w:ascii="BRH Malayalam Extra" w:hAnsi="BRH Malayalam Extra" w:cs="BRH Malayalam Extra"/>
-                <w:color w:val="000000"/>
-                <w:sz w:val="32"/>
-                <w:szCs w:val="40"/>
-              </w:rPr>
-              <w:t>—hx</w:t>
+              <w:t>)-  BRõ—hx</w:t>
             </w:r>
             <w:r>
               <w:rPr>
@@ -5112,27 +4818,7 @@
                 <w:sz w:val="32"/>
                 <w:szCs w:val="40"/>
               </w:rPr>
-              <w:t>)</w:t>
-            </w:r>
-            <w:proofErr w:type="gramStart"/>
-            <w:r>
-              <w:rPr>
-                <w:rFonts w:ascii="BRH Malayalam Extra" w:hAnsi="BRH Malayalam Extra" w:cs="BRH Malayalam Extra"/>
-                <w:color w:val="000000"/>
-                <w:sz w:val="32"/>
-                <w:szCs w:val="40"/>
-              </w:rPr>
-              <w:t>-  CZy</w:t>
-            </w:r>
-            <w:proofErr w:type="gramEnd"/>
-            <w:r>
-              <w:rPr>
-                <w:rFonts w:ascii="BRH Malayalam Extra" w:hAnsi="BRH Malayalam Extra" w:cs="BRH Malayalam Extra"/>
-                <w:color w:val="000000"/>
-                <w:sz w:val="32"/>
-                <w:szCs w:val="40"/>
-              </w:rPr>
-              <w:t>— | e¡</w:t>
+              <w:t>)-  CZy— | e¡</w:t>
             </w:r>
             <w:r>
               <w:rPr>
@@ -5499,27 +5185,7 @@
                 <w:sz w:val="32"/>
                 <w:szCs w:val="40"/>
               </w:rPr>
-              <w:t>)</w:t>
-            </w:r>
-            <w:proofErr w:type="gramStart"/>
-            <w:r>
-              <w:rPr>
-                <w:rFonts w:ascii="BRH Malayalam Extra" w:hAnsi="BRH Malayalam Extra" w:cs="BRH Malayalam Extra"/>
-                <w:color w:val="000000"/>
-                <w:sz w:val="32"/>
-                <w:szCs w:val="40"/>
-              </w:rPr>
-              <w:t>-  e</w:t>
-            </w:r>
-            <w:proofErr w:type="gramEnd"/>
-            <w:r>
-              <w:rPr>
-                <w:rFonts w:ascii="BRH Malayalam Extra" w:hAnsi="BRH Malayalam Extra" w:cs="BRH Malayalam Extra"/>
-                <w:color w:val="000000"/>
-                <w:sz w:val="32"/>
-                <w:szCs w:val="40"/>
-              </w:rPr>
-              <w:t>¡</w:t>
+              <w:t>)-  e¡</w:t>
             </w:r>
             <w:r>
               <w:rPr>
@@ -6077,27 +5743,7 @@
                 <w:sz w:val="32"/>
                 <w:szCs w:val="40"/>
               </w:rPr>
-              <w:t>)</w:t>
-            </w:r>
-            <w:proofErr w:type="gramStart"/>
-            <w:r>
-              <w:rPr>
-                <w:rFonts w:ascii="BRH Malayalam Extra" w:hAnsi="BRH Malayalam Extra" w:cs="BRH Malayalam Extra"/>
-                <w:color w:val="000000"/>
-                <w:sz w:val="32"/>
-                <w:szCs w:val="40"/>
-              </w:rPr>
-              <w:t>-  e</w:t>
-            </w:r>
-            <w:proofErr w:type="gramEnd"/>
-            <w:r>
-              <w:rPr>
-                <w:rFonts w:ascii="BRH Malayalam Extra" w:hAnsi="BRH Malayalam Extra" w:cs="BRH Malayalam Extra"/>
-                <w:color w:val="000000"/>
-                <w:sz w:val="32"/>
-                <w:szCs w:val="40"/>
-              </w:rPr>
-              <w:t>¡</w:t>
+              <w:t>)-  e¡</w:t>
             </w:r>
             <w:r>
               <w:rPr>
@@ -6395,27 +6041,7 @@
                 <w:sz w:val="32"/>
                 <w:szCs w:val="40"/>
               </w:rPr>
-              <w:t>)</w:t>
-            </w:r>
-            <w:proofErr w:type="gramStart"/>
-            <w:r>
-              <w:rPr>
-                <w:rFonts w:ascii="BRH Malayalam Extra" w:hAnsi="BRH Malayalam Extra" w:cs="BRH Malayalam Extra"/>
-                <w:color w:val="000000"/>
-                <w:sz w:val="32"/>
-                <w:szCs w:val="40"/>
-              </w:rPr>
-              <w:t>-  CZy</w:t>
-            </w:r>
-            <w:proofErr w:type="gramEnd"/>
-            <w:r>
-              <w:rPr>
-                <w:rFonts w:ascii="BRH Malayalam Extra" w:hAnsi="BRH Malayalam Extra" w:cs="BRH Malayalam Extra"/>
-                <w:color w:val="000000"/>
-                <w:sz w:val="32"/>
-                <w:szCs w:val="40"/>
-              </w:rPr>
-              <w:t>— | e¡</w:t>
+              <w:t>)-  CZy— | e¡</w:t>
             </w:r>
             <w:r>
               <w:rPr>
@@ -6756,27 +6382,7 @@
                 <w:sz w:val="32"/>
                 <w:szCs w:val="40"/>
               </w:rPr>
-              <w:t>)</w:t>
-            </w:r>
-            <w:proofErr w:type="gramStart"/>
-            <w:r>
-              <w:rPr>
-                <w:rFonts w:ascii="BRH Malayalam Extra" w:hAnsi="BRH Malayalam Extra" w:cs="BRH Malayalam Extra"/>
-                <w:color w:val="000000"/>
-                <w:sz w:val="32"/>
-                <w:szCs w:val="40"/>
-              </w:rPr>
-              <w:t>-  e</w:t>
-            </w:r>
-            <w:proofErr w:type="gramEnd"/>
-            <w:r>
-              <w:rPr>
-                <w:rFonts w:ascii="BRH Malayalam Extra" w:hAnsi="BRH Malayalam Extra" w:cs="BRH Malayalam Extra"/>
-                <w:color w:val="000000"/>
-                <w:sz w:val="32"/>
-                <w:szCs w:val="40"/>
-              </w:rPr>
-              <w:t>¡</w:t>
+              <w:t>)-  e¡</w:t>
             </w:r>
             <w:r>
               <w:rPr>
@@ -7272,27 +6878,7 @@
                 <w:sz w:val="32"/>
                 <w:szCs w:val="40"/>
               </w:rPr>
-              <w:t>)</w:t>
-            </w:r>
-            <w:proofErr w:type="gramStart"/>
-            <w:r>
-              <w:rPr>
-                <w:rFonts w:ascii="BRH Malayalam Extra" w:hAnsi="BRH Malayalam Extra" w:cs="BRH Malayalam Extra"/>
-                <w:color w:val="000000"/>
-                <w:sz w:val="32"/>
-                <w:szCs w:val="40"/>
-              </w:rPr>
-              <w:t>-  e</w:t>
-            </w:r>
-            <w:proofErr w:type="gramEnd"/>
-            <w:r>
-              <w:rPr>
-                <w:rFonts w:ascii="BRH Malayalam Extra" w:hAnsi="BRH Malayalam Extra" w:cs="BRH Malayalam Extra"/>
-                <w:color w:val="000000"/>
-                <w:sz w:val="32"/>
-                <w:szCs w:val="40"/>
-              </w:rPr>
-              <w:t>¡</w:t>
+              <w:t>)-  e¡</w:t>
             </w:r>
             <w:r>
               <w:rPr>
@@ -7578,27 +7164,7 @@
                 <w:sz w:val="32"/>
                 <w:szCs w:val="40"/>
               </w:rPr>
-              <w:t>)</w:t>
-            </w:r>
-            <w:proofErr w:type="gramStart"/>
-            <w:r>
-              <w:rPr>
-                <w:rFonts w:ascii="BRH Malayalam Extra" w:hAnsi="BRH Malayalam Extra" w:cs="BRH Malayalam Extra"/>
-                <w:color w:val="000000"/>
-                <w:sz w:val="32"/>
-                <w:szCs w:val="40"/>
-              </w:rPr>
-              <w:t>-  d</w:t>
-            </w:r>
-            <w:proofErr w:type="gramEnd"/>
-            <w:r>
-              <w:rPr>
-                <w:rFonts w:ascii="BRH Malayalam Extra" w:hAnsi="BRH Malayalam Extra" w:cs="BRH Malayalam Extra"/>
-                <w:color w:val="000000"/>
-                <w:sz w:val="32"/>
-                <w:szCs w:val="40"/>
-              </w:rPr>
-              <w:t>¡</w:t>
+              <w:t>)-  d¡</w:t>
             </w:r>
             <w:r>
               <w:rPr>
@@ -8080,19 +7646,8 @@
                 <w:sz w:val="32"/>
                 <w:szCs w:val="40"/>
               </w:rPr>
-              <w:t>)</w:t>
-            </w:r>
-            <w:proofErr w:type="gramStart"/>
-            <w:r>
-              <w:rPr>
-                <w:rFonts w:ascii="BRH Malayalam Extra" w:hAnsi="BRH Malayalam Extra" w:cs="BRH Malayalam Extra"/>
-                <w:color w:val="000000"/>
-                <w:sz w:val="32"/>
-                <w:szCs w:val="40"/>
-              </w:rPr>
-              <w:t>-  D</w:t>
-            </w:r>
-            <w:proofErr w:type="gramEnd"/>
+              <w:t>)-  D</w:t>
+            </w:r>
             <w:r>
               <w:rPr>
                 <w:rFonts w:ascii="BRH Malayalam Extra" w:hAnsi="BRH Malayalam Extra" w:cs="BRH Malayalam Extra"/>
@@ -8507,19 +8062,8 @@
                 <w:sz w:val="32"/>
                 <w:szCs w:val="40"/>
               </w:rPr>
-              <w:t>)</w:t>
-            </w:r>
-            <w:proofErr w:type="gramStart"/>
-            <w:r>
-              <w:rPr>
-                <w:rFonts w:ascii="BRH Malayalam Extra" w:hAnsi="BRH Malayalam Extra" w:cs="BRH Malayalam Extra"/>
-                <w:color w:val="000000"/>
-                <w:sz w:val="32"/>
-                <w:szCs w:val="40"/>
-              </w:rPr>
-              <w:t>-  D</w:t>
-            </w:r>
-            <w:proofErr w:type="gramEnd"/>
+              <w:t>)-  D</w:t>
+            </w:r>
             <w:r>
               <w:rPr>
                 <w:rFonts w:ascii="BRH Malayalam Extra" w:hAnsi="BRH Malayalam Extra" w:cs="BRH Malayalam Extra"/>
@@ -8831,27 +8375,7 @@
                 <w:sz w:val="32"/>
                 <w:szCs w:val="40"/>
               </w:rPr>
-              <w:t>)</w:t>
-            </w:r>
-            <w:proofErr w:type="gramStart"/>
-            <w:r>
-              <w:rPr>
-                <w:rFonts w:ascii="BRH Malayalam Extra" w:hAnsi="BRH Malayalam Extra" w:cs="BRH Malayalam Extra"/>
-                <w:color w:val="000000"/>
-                <w:sz w:val="32"/>
-                <w:szCs w:val="40"/>
-              </w:rPr>
-              <w:t>-  d</w:t>
-            </w:r>
-            <w:proofErr w:type="gramEnd"/>
-            <w:r>
-              <w:rPr>
-                <w:rFonts w:ascii="BRH Malayalam Extra" w:hAnsi="BRH Malayalam Extra" w:cs="BRH Malayalam Extra"/>
-                <w:color w:val="000000"/>
-                <w:sz w:val="32"/>
-                <w:szCs w:val="40"/>
-              </w:rPr>
-              <w:t>¡</w:t>
+              <w:t>)-  d¡</w:t>
             </w:r>
             <w:r>
               <w:rPr>
@@ -9331,19 +8855,8 @@
                 <w:sz w:val="32"/>
                 <w:szCs w:val="40"/>
               </w:rPr>
-              <w:t>)</w:t>
-            </w:r>
-            <w:proofErr w:type="gramStart"/>
-            <w:r>
-              <w:rPr>
-                <w:rFonts w:ascii="BRH Malayalam Extra" w:hAnsi="BRH Malayalam Extra" w:cs="BRH Malayalam Extra"/>
-                <w:color w:val="000000"/>
-                <w:sz w:val="32"/>
-                <w:szCs w:val="40"/>
-              </w:rPr>
-              <w:t>-  D</w:t>
-            </w:r>
-            <w:proofErr w:type="gramEnd"/>
+              <w:t>)-  D</w:t>
+            </w:r>
             <w:r>
               <w:rPr>
                 <w:rFonts w:ascii="BRH Malayalam Extra" w:hAnsi="BRH Malayalam Extra" w:cs="BRH Malayalam Extra"/>
@@ -9729,19 +9242,8 @@
                 <w:sz w:val="32"/>
                 <w:szCs w:val="40"/>
               </w:rPr>
-              <w:t>)</w:t>
-            </w:r>
-            <w:proofErr w:type="gramStart"/>
-            <w:r>
-              <w:rPr>
-                <w:rFonts w:ascii="BRH Malayalam Extra" w:hAnsi="BRH Malayalam Extra" w:cs="BRH Malayalam Extra"/>
-                <w:color w:val="000000"/>
-                <w:sz w:val="32"/>
-                <w:szCs w:val="40"/>
-              </w:rPr>
-              <w:t>-  D</w:t>
-            </w:r>
-            <w:proofErr w:type="gramEnd"/>
+              <w:t>)-  D</w:t>
+            </w:r>
             <w:r>
               <w:rPr>
                 <w:rFonts w:ascii="BRH Malayalam Extra" w:hAnsi="BRH Malayalam Extra" w:cs="BRH Malayalam Extra"/>
@@ -10040,27 +9542,7 @@
                 <w:sz w:val="32"/>
                 <w:szCs w:val="40"/>
               </w:rPr>
-              <w:t>)</w:t>
-            </w:r>
-            <w:proofErr w:type="gramStart"/>
-            <w:r>
-              <w:rPr>
-                <w:rFonts w:ascii="BRH Malayalam Extra" w:hAnsi="BRH Malayalam Extra" w:cs="BRH Malayalam Extra"/>
-                <w:color w:val="000000"/>
-                <w:sz w:val="32"/>
-                <w:szCs w:val="40"/>
-              </w:rPr>
-              <w:t>-  d</w:t>
-            </w:r>
-            <w:proofErr w:type="gramEnd"/>
-            <w:r>
-              <w:rPr>
-                <w:rFonts w:ascii="BRH Malayalam Extra" w:hAnsi="BRH Malayalam Extra" w:cs="BRH Malayalam Extra"/>
-                <w:color w:val="000000"/>
-                <w:sz w:val="32"/>
-                <w:szCs w:val="40"/>
-              </w:rPr>
-              <w:t>¡</w:t>
+              <w:t>)-  d¡</w:t>
             </w:r>
             <w:r>
               <w:rPr>
@@ -10557,27 +10039,7 @@
                 <w:sz w:val="32"/>
                 <w:szCs w:val="40"/>
               </w:rPr>
-              <w:t>)</w:t>
-            </w:r>
-            <w:proofErr w:type="gramStart"/>
-            <w:r>
-              <w:rPr>
-                <w:rFonts w:ascii="BRH Malayalam Extra" w:hAnsi="BRH Malayalam Extra" w:cs="BRH Malayalam Extra"/>
-                <w:color w:val="000000"/>
-                <w:sz w:val="32"/>
-                <w:szCs w:val="40"/>
-              </w:rPr>
-              <w:t>-  e</w:t>
-            </w:r>
-            <w:proofErr w:type="gramEnd"/>
-            <w:r>
-              <w:rPr>
-                <w:rFonts w:ascii="BRH Malayalam Extra" w:hAnsi="BRH Malayalam Extra" w:cs="BRH Malayalam Extra"/>
-                <w:color w:val="000000"/>
-                <w:sz w:val="32"/>
-                <w:szCs w:val="40"/>
-              </w:rPr>
-              <w:t>¡</w:t>
+              <w:t>)-  e¡</w:t>
             </w:r>
             <w:r>
               <w:rPr>
@@ -11135,27 +10597,7 @@
                 <w:sz w:val="32"/>
                 <w:szCs w:val="40"/>
               </w:rPr>
-              <w:t>)</w:t>
-            </w:r>
-            <w:proofErr w:type="gramStart"/>
-            <w:r>
-              <w:rPr>
-                <w:rFonts w:ascii="BRH Malayalam Extra" w:hAnsi="BRH Malayalam Extra" w:cs="BRH Malayalam Extra"/>
-                <w:color w:val="000000"/>
-                <w:sz w:val="32"/>
-                <w:szCs w:val="40"/>
-              </w:rPr>
-              <w:t>-  e</w:t>
-            </w:r>
-            <w:proofErr w:type="gramEnd"/>
-            <w:r>
-              <w:rPr>
-                <w:rFonts w:ascii="BRH Malayalam Extra" w:hAnsi="BRH Malayalam Extra" w:cs="BRH Malayalam Extra"/>
-                <w:color w:val="000000"/>
-                <w:sz w:val="32"/>
-                <w:szCs w:val="40"/>
-              </w:rPr>
-              <w:t>¡</w:t>
+              <w:t>)-  e¡</w:t>
             </w:r>
             <w:r>
               <w:rPr>
@@ -11453,27 +10895,7 @@
                 <w:sz w:val="32"/>
                 <w:szCs w:val="40"/>
               </w:rPr>
-              <w:t>)</w:t>
-            </w:r>
-            <w:proofErr w:type="gramStart"/>
-            <w:r>
-              <w:rPr>
-                <w:rFonts w:ascii="BRH Malayalam Extra" w:hAnsi="BRH Malayalam Extra" w:cs="BRH Malayalam Extra"/>
-                <w:color w:val="000000"/>
-                <w:sz w:val="32"/>
-                <w:szCs w:val="40"/>
-              </w:rPr>
-              <w:t>-  d</w:t>
-            </w:r>
-            <w:proofErr w:type="gramEnd"/>
-            <w:r>
-              <w:rPr>
-                <w:rFonts w:ascii="BRH Malayalam Extra" w:hAnsi="BRH Malayalam Extra" w:cs="BRH Malayalam Extra"/>
-                <w:color w:val="000000"/>
-                <w:sz w:val="32"/>
-                <w:szCs w:val="40"/>
-              </w:rPr>
-              <w:t>¡</w:t>
+              <w:t>)-  d¡</w:t>
             </w:r>
             <w:r>
               <w:rPr>
@@ -11898,27 +11320,7 @@
                 <w:sz w:val="32"/>
                 <w:szCs w:val="40"/>
               </w:rPr>
-              <w:t>)</w:t>
-            </w:r>
-            <w:proofErr w:type="gramStart"/>
-            <w:r>
-              <w:rPr>
-                <w:rFonts w:ascii="BRH Malayalam Extra" w:hAnsi="BRH Malayalam Extra" w:cs="BRH Malayalam Extra"/>
-                <w:color w:val="000000"/>
-                <w:sz w:val="32"/>
-                <w:szCs w:val="40"/>
-              </w:rPr>
-              <w:t>-  e</w:t>
-            </w:r>
-            <w:proofErr w:type="gramEnd"/>
-            <w:r>
-              <w:rPr>
-                <w:rFonts w:ascii="BRH Malayalam Extra" w:hAnsi="BRH Malayalam Extra" w:cs="BRH Malayalam Extra"/>
-                <w:color w:val="000000"/>
-                <w:sz w:val="32"/>
-                <w:szCs w:val="40"/>
-              </w:rPr>
-              <w:t>¡</w:t>
+              <w:t>)-  e¡</w:t>
             </w:r>
             <w:r>
               <w:rPr>
@@ -12414,27 +11816,7 @@
                 <w:sz w:val="32"/>
                 <w:szCs w:val="40"/>
               </w:rPr>
-              <w:t>)</w:t>
-            </w:r>
-            <w:proofErr w:type="gramStart"/>
-            <w:r>
-              <w:rPr>
-                <w:rFonts w:ascii="BRH Malayalam Extra" w:hAnsi="BRH Malayalam Extra" w:cs="BRH Malayalam Extra"/>
-                <w:color w:val="000000"/>
-                <w:sz w:val="32"/>
-                <w:szCs w:val="40"/>
-              </w:rPr>
-              <w:t>-  e</w:t>
-            </w:r>
-            <w:proofErr w:type="gramEnd"/>
-            <w:r>
-              <w:rPr>
-                <w:rFonts w:ascii="BRH Malayalam Extra" w:hAnsi="BRH Malayalam Extra" w:cs="BRH Malayalam Extra"/>
-                <w:color w:val="000000"/>
-                <w:sz w:val="32"/>
-                <w:szCs w:val="40"/>
-              </w:rPr>
-              <w:t>¡</w:t>
+              <w:t>)-  e¡</w:t>
             </w:r>
             <w:r>
               <w:rPr>
@@ -12720,19 +12102,8 @@
                 <w:sz w:val="32"/>
                 <w:szCs w:val="40"/>
               </w:rPr>
-              <w:t>)</w:t>
-            </w:r>
-            <w:proofErr w:type="gramStart"/>
-            <w:r>
-              <w:rPr>
-                <w:rFonts w:ascii="BRH Malayalam Extra" w:hAnsi="BRH Malayalam Extra" w:cs="BRH Malayalam Extra"/>
-                <w:color w:val="000000"/>
-                <w:sz w:val="32"/>
-                <w:szCs w:val="40"/>
-              </w:rPr>
-              <w:t>-  c</w:t>
-            </w:r>
-            <w:proofErr w:type="gramEnd"/>
+              <w:t>)-  c</w:t>
+            </w:r>
             <w:r>
               <w:rPr>
                 <w:rFonts w:ascii="BRH Malayalam Extra" w:hAnsi="BRH Malayalam Extra" w:cs="BRH Malayalam Extra"/>
@@ -13184,19 +12555,8 @@
                 <w:sz w:val="32"/>
                 <w:szCs w:val="40"/>
               </w:rPr>
-              <w:t>)</w:t>
-            </w:r>
-            <w:proofErr w:type="gramStart"/>
-            <w:r>
-              <w:rPr>
-                <w:rFonts w:ascii="BRH Malayalam Extra" w:hAnsi="BRH Malayalam Extra" w:cs="BRH Malayalam Extra"/>
-                <w:color w:val="000000"/>
-                <w:sz w:val="32"/>
-                <w:szCs w:val="40"/>
-              </w:rPr>
-              <w:t>-  D</w:t>
-            </w:r>
-            <w:proofErr w:type="gramEnd"/>
+              <w:t>)-  D</w:t>
+            </w:r>
             <w:r>
               <w:rPr>
                 <w:rFonts w:ascii="BRH Malayalam Extra" w:hAnsi="BRH Malayalam Extra" w:cs="BRH Malayalam Extra"/>
@@ -13620,19 +12980,8 @@
                 <w:sz w:val="32"/>
                 <w:szCs w:val="40"/>
               </w:rPr>
-              <w:t>)</w:t>
-            </w:r>
-            <w:proofErr w:type="gramStart"/>
-            <w:r>
-              <w:rPr>
-                <w:rFonts w:ascii="BRH Malayalam Extra" w:hAnsi="BRH Malayalam Extra" w:cs="BRH Malayalam Extra"/>
-                <w:color w:val="000000"/>
-                <w:sz w:val="32"/>
-                <w:szCs w:val="40"/>
-              </w:rPr>
-              <w:t>-  D</w:t>
-            </w:r>
-            <w:proofErr w:type="gramEnd"/>
+              <w:t>)-  D</w:t>
+            </w:r>
             <w:r>
               <w:rPr>
                 <w:rFonts w:ascii="BRH Malayalam Extra" w:hAnsi="BRH Malayalam Extra" w:cs="BRH Malayalam Extra"/>
@@ -13944,19 +13293,8 @@
                 <w:sz w:val="32"/>
                 <w:szCs w:val="40"/>
               </w:rPr>
-              <w:t>)</w:t>
-            </w:r>
-            <w:proofErr w:type="gramStart"/>
-            <w:r>
-              <w:rPr>
-                <w:rFonts w:ascii="BRH Malayalam Extra" w:hAnsi="BRH Malayalam Extra" w:cs="BRH Malayalam Extra"/>
-                <w:color w:val="000000"/>
-                <w:sz w:val="32"/>
-                <w:szCs w:val="40"/>
-              </w:rPr>
-              <w:t>-  c</w:t>
-            </w:r>
-            <w:proofErr w:type="gramEnd"/>
+              <w:t>)-  c</w:t>
+            </w:r>
             <w:r>
               <w:rPr>
                 <w:rFonts w:ascii="BRH Malayalam Extra" w:hAnsi="BRH Malayalam Extra" w:cs="BRH Malayalam Extra"/>
@@ -14354,19 +13692,8 @@
                 <w:sz w:val="32"/>
                 <w:szCs w:val="40"/>
               </w:rPr>
-              <w:t>)</w:t>
-            </w:r>
-            <w:proofErr w:type="gramStart"/>
-            <w:r>
-              <w:rPr>
-                <w:rFonts w:ascii="BRH Malayalam Extra" w:hAnsi="BRH Malayalam Extra" w:cs="BRH Malayalam Extra"/>
-                <w:color w:val="000000"/>
-                <w:sz w:val="32"/>
-                <w:szCs w:val="40"/>
-              </w:rPr>
-              <w:t>-  D</w:t>
-            </w:r>
-            <w:proofErr w:type="gramEnd"/>
+              <w:t>)-  D</w:t>
+            </w:r>
             <w:r>
               <w:rPr>
                 <w:rFonts w:ascii="BRH Malayalam Extra" w:hAnsi="BRH Malayalam Extra" w:cs="BRH Malayalam Extra"/>
@@ -14742,19 +14069,8 @@
                 <w:sz w:val="32"/>
                 <w:szCs w:val="40"/>
               </w:rPr>
-              <w:t>)</w:t>
-            </w:r>
-            <w:proofErr w:type="gramStart"/>
-            <w:r>
-              <w:rPr>
-                <w:rFonts w:ascii="BRH Malayalam Extra" w:hAnsi="BRH Malayalam Extra" w:cs="BRH Malayalam Extra"/>
-                <w:color w:val="000000"/>
-                <w:sz w:val="32"/>
-                <w:szCs w:val="40"/>
-              </w:rPr>
-              <w:t>-  D</w:t>
-            </w:r>
-            <w:proofErr w:type="gramEnd"/>
+              <w:t>)-  D</w:t>
+            </w:r>
             <w:r>
               <w:rPr>
                 <w:rFonts w:ascii="BRH Malayalam Extra" w:hAnsi="BRH Malayalam Extra" w:cs="BRH Malayalam Extra"/>
@@ -15053,27 +14369,7 @@
                 <w:sz w:val="32"/>
                 <w:szCs w:val="40"/>
               </w:rPr>
-              <w:t>)</w:t>
-            </w:r>
-            <w:proofErr w:type="gramStart"/>
-            <w:r>
-              <w:rPr>
-                <w:rFonts w:ascii="BRH Malayalam Extra" w:hAnsi="BRH Malayalam Extra" w:cs="BRH Malayalam Extra"/>
-                <w:color w:val="000000"/>
-                <w:sz w:val="32"/>
-                <w:szCs w:val="40"/>
-              </w:rPr>
-              <w:t>-  ¥</w:t>
-            </w:r>
-            <w:proofErr w:type="gramEnd"/>
-            <w:r>
-              <w:rPr>
-                <w:rFonts w:ascii="BRH Malayalam Extra" w:hAnsi="BRH Malayalam Extra" w:cs="BRH Malayalam Extra"/>
-                <w:color w:val="000000"/>
-                <w:sz w:val="32"/>
-                <w:szCs w:val="40"/>
-              </w:rPr>
-              <w:t>pb— | e¡</w:t>
+              <w:t>)-  ¥pb— | e¡</w:t>
             </w:r>
             <w:r>
               <w:rPr>
@@ -15487,27 +14783,7 @@
                 <w:sz w:val="32"/>
                 <w:szCs w:val="40"/>
               </w:rPr>
-              <w:t>)</w:t>
-            </w:r>
-            <w:proofErr w:type="gramStart"/>
-            <w:r>
-              <w:rPr>
-                <w:rFonts w:ascii="BRH Malayalam Extra" w:hAnsi="BRH Malayalam Extra" w:cs="BRH Malayalam Extra"/>
-                <w:color w:val="000000"/>
-                <w:sz w:val="32"/>
-                <w:szCs w:val="40"/>
-              </w:rPr>
-              <w:t>-  e</w:t>
-            </w:r>
-            <w:proofErr w:type="gramEnd"/>
-            <w:r>
-              <w:rPr>
-                <w:rFonts w:ascii="BRH Malayalam Extra" w:hAnsi="BRH Malayalam Extra" w:cs="BRH Malayalam Extra"/>
-                <w:color w:val="000000"/>
-                <w:sz w:val="32"/>
-                <w:szCs w:val="40"/>
-              </w:rPr>
-              <w:t>¡</w:t>
+              <w:t>)-  e¡</w:t>
             </w:r>
             <w:r>
               <w:rPr>
@@ -16065,27 +15341,7 @@
                 <w:sz w:val="32"/>
                 <w:szCs w:val="40"/>
               </w:rPr>
-              <w:t>)</w:t>
-            </w:r>
-            <w:proofErr w:type="gramStart"/>
-            <w:r>
-              <w:rPr>
-                <w:rFonts w:ascii="BRH Malayalam Extra" w:hAnsi="BRH Malayalam Extra" w:cs="BRH Malayalam Extra"/>
-                <w:color w:val="000000"/>
-                <w:sz w:val="32"/>
-                <w:szCs w:val="40"/>
-              </w:rPr>
-              <w:t>-  e</w:t>
-            </w:r>
-            <w:proofErr w:type="gramEnd"/>
-            <w:r>
-              <w:rPr>
-                <w:rFonts w:ascii="BRH Malayalam Extra" w:hAnsi="BRH Malayalam Extra" w:cs="BRH Malayalam Extra"/>
-                <w:color w:val="000000"/>
-                <w:sz w:val="32"/>
-                <w:szCs w:val="40"/>
-              </w:rPr>
-              <w:t>¡</w:t>
+              <w:t>)-  e¡</w:t>
             </w:r>
             <w:r>
               <w:rPr>
@@ -16383,27 +15639,7 @@
                 <w:sz w:val="32"/>
                 <w:szCs w:val="40"/>
               </w:rPr>
-              <w:t>)</w:t>
-            </w:r>
-            <w:proofErr w:type="gramStart"/>
-            <w:r>
-              <w:rPr>
-                <w:rFonts w:ascii="BRH Malayalam Extra" w:hAnsi="BRH Malayalam Extra" w:cs="BRH Malayalam Extra"/>
-                <w:color w:val="000000"/>
-                <w:sz w:val="32"/>
-                <w:szCs w:val="40"/>
-              </w:rPr>
-              <w:t>-  ¥</w:t>
-            </w:r>
-            <w:proofErr w:type="gramEnd"/>
-            <w:r>
-              <w:rPr>
-                <w:rFonts w:ascii="BRH Malayalam Extra" w:hAnsi="BRH Malayalam Extra" w:cs="BRH Malayalam Extra"/>
-                <w:color w:val="000000"/>
-                <w:sz w:val="32"/>
-                <w:szCs w:val="40"/>
-              </w:rPr>
-              <w:t>pb— | e¡</w:t>
+              <w:t>)-  ¥pb— | e¡</w:t>
             </w:r>
             <w:r>
               <w:rPr>
@@ -16753,27 +15989,7 @@
                 <w:sz w:val="32"/>
                 <w:szCs w:val="40"/>
               </w:rPr>
-              <w:t>)</w:t>
-            </w:r>
-            <w:proofErr w:type="gramStart"/>
-            <w:r>
-              <w:rPr>
-                <w:rFonts w:ascii="BRH Malayalam Extra" w:hAnsi="BRH Malayalam Extra" w:cs="BRH Malayalam Extra"/>
-                <w:color w:val="000000"/>
-                <w:sz w:val="32"/>
-                <w:szCs w:val="40"/>
-              </w:rPr>
-              <w:t>-  e</w:t>
-            </w:r>
-            <w:proofErr w:type="gramEnd"/>
-            <w:r>
-              <w:rPr>
-                <w:rFonts w:ascii="BRH Malayalam Extra" w:hAnsi="BRH Malayalam Extra" w:cs="BRH Malayalam Extra"/>
-                <w:color w:val="000000"/>
-                <w:sz w:val="32"/>
-                <w:szCs w:val="40"/>
-              </w:rPr>
-              <w:t>¡</w:t>
+              <w:t>)-  e¡</w:t>
             </w:r>
             <w:r>
               <w:rPr>
@@ -17259,27 +16475,7 @@
                 <w:sz w:val="32"/>
                 <w:szCs w:val="40"/>
               </w:rPr>
-              <w:t>)</w:t>
-            </w:r>
-            <w:proofErr w:type="gramStart"/>
-            <w:r>
-              <w:rPr>
-                <w:rFonts w:ascii="BRH Malayalam Extra" w:hAnsi="BRH Malayalam Extra" w:cs="BRH Malayalam Extra"/>
-                <w:color w:val="000000"/>
-                <w:sz w:val="32"/>
-                <w:szCs w:val="40"/>
-              </w:rPr>
-              <w:t>-  e</w:t>
-            </w:r>
-            <w:proofErr w:type="gramEnd"/>
-            <w:r>
-              <w:rPr>
-                <w:rFonts w:ascii="BRH Malayalam Extra" w:hAnsi="BRH Malayalam Extra" w:cs="BRH Malayalam Extra"/>
-                <w:color w:val="000000"/>
-                <w:sz w:val="32"/>
-                <w:szCs w:val="40"/>
-              </w:rPr>
-              <w:t>¡</w:t>
+              <w:t>)-  e¡</w:t>
             </w:r>
             <w:r>
               <w:rPr>
@@ -17565,27 +16761,7 @@
                 <w:sz w:val="32"/>
                 <w:szCs w:val="40"/>
               </w:rPr>
-              <w:t>)</w:t>
-            </w:r>
-            <w:proofErr w:type="gramStart"/>
-            <w:r>
-              <w:rPr>
-                <w:rFonts w:ascii="BRH Malayalam Extra" w:hAnsi="BRH Malayalam Extra" w:cs="BRH Malayalam Extra"/>
-                <w:color w:val="000000"/>
-                <w:sz w:val="32"/>
-                <w:szCs w:val="40"/>
-              </w:rPr>
-              <w:t>-  h</w:t>
-            </w:r>
-            <w:proofErr w:type="gramEnd"/>
-            <w:r>
-              <w:rPr>
-                <w:rFonts w:ascii="BRH Malayalam Extra" w:hAnsi="BRH Malayalam Extra" w:cs="BRH Malayalam Extra"/>
-                <w:color w:val="000000"/>
-                <w:sz w:val="32"/>
-                <w:szCs w:val="40"/>
-              </w:rPr>
-              <w:t>¡</w:t>
+              <w:t>)-  h¡</w:t>
             </w:r>
             <w:r>
               <w:rPr>
@@ -18089,19 +17265,8 @@
                 <w:sz w:val="32"/>
                 <w:szCs w:val="40"/>
               </w:rPr>
-              <w:t>)</w:t>
-            </w:r>
-            <w:proofErr w:type="gramStart"/>
-            <w:r>
-              <w:rPr>
-                <w:rFonts w:ascii="BRH Malayalam Extra" w:hAnsi="BRH Malayalam Extra" w:cs="BRH Malayalam Extra"/>
-                <w:color w:val="000000"/>
-                <w:sz w:val="32"/>
-                <w:szCs w:val="40"/>
-              </w:rPr>
-              <w:t>-  D</w:t>
-            </w:r>
-            <w:proofErr w:type="gramEnd"/>
+              <w:t>)-  D</w:t>
+            </w:r>
             <w:r>
               <w:rPr>
                 <w:rFonts w:ascii="BRH Malayalam Extra" w:hAnsi="BRH Malayalam Extra" w:cs="BRH Malayalam Extra"/>
@@ -18525,19 +17690,8 @@
                 <w:sz w:val="32"/>
                 <w:szCs w:val="40"/>
               </w:rPr>
-              <w:t>)</w:t>
-            </w:r>
-            <w:proofErr w:type="gramStart"/>
-            <w:r>
-              <w:rPr>
-                <w:rFonts w:ascii="BRH Malayalam Extra" w:hAnsi="BRH Malayalam Extra" w:cs="BRH Malayalam Extra"/>
-                <w:color w:val="000000"/>
-                <w:sz w:val="32"/>
-                <w:szCs w:val="40"/>
-              </w:rPr>
-              <w:t>-  D</w:t>
-            </w:r>
-            <w:proofErr w:type="gramEnd"/>
+              <w:t>)-  D</w:t>
+            </w:r>
             <w:r>
               <w:rPr>
                 <w:rFonts w:ascii="BRH Malayalam Extra" w:hAnsi="BRH Malayalam Extra" w:cs="BRH Malayalam Extra"/>
@@ -18849,27 +18003,7 @@
                 <w:sz w:val="32"/>
                 <w:szCs w:val="40"/>
               </w:rPr>
-              <w:t>)</w:t>
-            </w:r>
-            <w:proofErr w:type="gramStart"/>
-            <w:r>
-              <w:rPr>
-                <w:rFonts w:ascii="BRH Malayalam Extra" w:hAnsi="BRH Malayalam Extra" w:cs="BRH Malayalam Extra"/>
-                <w:color w:val="000000"/>
-                <w:sz w:val="32"/>
-                <w:szCs w:val="40"/>
-              </w:rPr>
-              <w:t>-  h</w:t>
-            </w:r>
-            <w:proofErr w:type="gramEnd"/>
-            <w:r>
-              <w:rPr>
-                <w:rFonts w:ascii="BRH Malayalam Extra" w:hAnsi="BRH Malayalam Extra" w:cs="BRH Malayalam Extra"/>
-                <w:color w:val="000000"/>
-                <w:sz w:val="32"/>
-                <w:szCs w:val="40"/>
-              </w:rPr>
-              <w:t>¡</w:t>
+              <w:t>)-  h¡</w:t>
             </w:r>
             <w:r>
               <w:rPr>
@@ -19310,19 +18444,8 @@
                 <w:sz w:val="32"/>
                 <w:szCs w:val="40"/>
               </w:rPr>
-              <w:t>)</w:t>
-            </w:r>
-            <w:proofErr w:type="gramStart"/>
-            <w:r>
-              <w:rPr>
-                <w:rFonts w:ascii="BRH Malayalam Extra" w:hAnsi="BRH Malayalam Extra" w:cs="BRH Malayalam Extra"/>
-                <w:color w:val="000000"/>
-                <w:sz w:val="32"/>
-                <w:szCs w:val="40"/>
-              </w:rPr>
-              <w:t>-  D</w:t>
-            </w:r>
-            <w:proofErr w:type="gramEnd"/>
+              <w:t>)-  D</w:t>
+            </w:r>
             <w:r>
               <w:rPr>
                 <w:rFonts w:ascii="BRH Malayalam Extra" w:hAnsi="BRH Malayalam Extra" w:cs="BRH Malayalam Extra"/>
@@ -19698,19 +18821,8 @@
                 <w:sz w:val="32"/>
                 <w:szCs w:val="40"/>
               </w:rPr>
-              <w:t>)</w:t>
-            </w:r>
-            <w:proofErr w:type="gramStart"/>
-            <w:r>
-              <w:rPr>
-                <w:rFonts w:ascii="BRH Malayalam Extra" w:hAnsi="BRH Malayalam Extra" w:cs="BRH Malayalam Extra"/>
-                <w:color w:val="000000"/>
-                <w:sz w:val="32"/>
-                <w:szCs w:val="40"/>
-              </w:rPr>
-              <w:t>-  D</w:t>
-            </w:r>
-            <w:proofErr w:type="gramEnd"/>
+              <w:t>)-  D</w:t>
+            </w:r>
             <w:r>
               <w:rPr>
                 <w:rFonts w:ascii="BRH Malayalam Extra" w:hAnsi="BRH Malayalam Extra" w:cs="BRH Malayalam Extra"/>
@@ -20009,19 +19121,8 @@
                 <w:sz w:val="32"/>
                 <w:szCs w:val="40"/>
               </w:rPr>
-              <w:t>)</w:t>
-            </w:r>
-            <w:proofErr w:type="gramStart"/>
-            <w:r>
-              <w:rPr>
-                <w:rFonts w:ascii="BRH Malayalam Extra" w:hAnsi="BRH Malayalam Extra" w:cs="BRH Malayalam Extra"/>
-                <w:color w:val="000000"/>
-                <w:sz w:val="32"/>
-                <w:szCs w:val="40"/>
-              </w:rPr>
-              <w:t>-  jx</w:t>
-            </w:r>
-            <w:proofErr w:type="gramEnd"/>
+              <w:t>)-  jx</w:t>
+            </w:r>
             <w:r>
               <w:rPr>
                 <w:rFonts w:ascii="BRH Malayalam Extra" w:hAnsi="BRH Malayalam Extra" w:cs="BRH Malayalam Extra"/>
@@ -20282,19 +19383,8 @@
                 <w:sz w:val="32"/>
                 <w:szCs w:val="40"/>
               </w:rPr>
-              <w:t>)</w:t>
-            </w:r>
-            <w:proofErr w:type="gramStart"/>
-            <w:r>
-              <w:rPr>
-                <w:rFonts w:ascii="BRH Malayalam Extra" w:hAnsi="BRH Malayalam Extra" w:cs="BRH Malayalam Extra"/>
-                <w:color w:val="000000"/>
-                <w:sz w:val="32"/>
-                <w:szCs w:val="40"/>
-              </w:rPr>
-              <w:t>-  jx</w:t>
-            </w:r>
-            <w:proofErr w:type="gramEnd"/>
+              <w:t>)-  jx</w:t>
+            </w:r>
             <w:r>
               <w:rPr>
                 <w:rFonts w:ascii="BRH Malayalam Extra" w:hAnsi="BRH Malayalam Extra" w:cs="BRH Malayalam Extra"/>
@@ -20561,27 +19651,7 @@
                 <w:sz w:val="32"/>
                 <w:szCs w:val="40"/>
               </w:rPr>
-              <w:t>)</w:t>
-            </w:r>
-            <w:proofErr w:type="gramStart"/>
-            <w:r>
-              <w:rPr>
-                <w:rFonts w:ascii="BRH Malayalam Extra" w:hAnsi="BRH Malayalam Extra" w:cs="BRH Malayalam Extra"/>
-                <w:color w:val="000000"/>
-                <w:sz w:val="32"/>
-                <w:szCs w:val="40"/>
-              </w:rPr>
-              <w:t>-  k</w:t>
-            </w:r>
-            <w:proofErr w:type="gramEnd"/>
-            <w:r>
-              <w:rPr>
-                <w:rFonts w:ascii="BRH Malayalam Extra" w:hAnsi="BRH Malayalam Extra" w:cs="BRH Malayalam Extra"/>
-                <w:color w:val="000000"/>
-                <w:sz w:val="32"/>
-                <w:szCs w:val="40"/>
-              </w:rPr>
-              <w:t>¡</w:t>
+              <w:t>)-  k¡</w:t>
             </w:r>
             <w:r>
               <w:rPr>
@@ -21177,19 +20247,8 @@
                 <w:sz w:val="32"/>
                 <w:szCs w:val="40"/>
               </w:rPr>
-              <w:t>)</w:t>
-            </w:r>
-            <w:proofErr w:type="gramStart"/>
-            <w:r>
-              <w:rPr>
-                <w:rFonts w:ascii="BRH Malayalam Extra" w:hAnsi="BRH Malayalam Extra" w:cs="BRH Malayalam Extra"/>
-                <w:color w:val="000000"/>
-                <w:sz w:val="32"/>
-                <w:szCs w:val="40"/>
-              </w:rPr>
-              <w:t>-  bûõ</w:t>
-            </w:r>
-            <w:proofErr w:type="gramEnd"/>
+              <w:t>)-  bûõ</w:t>
+            </w:r>
             <w:r>
               <w:rPr>
                 <w:rFonts w:ascii="BRH Malayalam Extra" w:hAnsi="BRH Malayalam Extra" w:cs="BRH Malayalam Extra"/>
@@ -21669,19 +20728,8 @@
                 <w:sz w:val="32"/>
                 <w:szCs w:val="40"/>
               </w:rPr>
-              <w:t>)</w:t>
-            </w:r>
-            <w:proofErr w:type="gramStart"/>
-            <w:r>
-              <w:rPr>
-                <w:rFonts w:ascii="BRH Malayalam Extra" w:hAnsi="BRH Malayalam Extra" w:cs="BRH Malayalam Extra"/>
-                <w:color w:val="000000"/>
-                <w:sz w:val="32"/>
-                <w:szCs w:val="40"/>
-              </w:rPr>
-              <w:t>-  bûõ</w:t>
-            </w:r>
-            <w:proofErr w:type="gramEnd"/>
+              <w:t>)-  bûõ</w:t>
+            </w:r>
             <w:r>
               <w:rPr>
                 <w:rFonts w:ascii="BRH Malayalam Extra" w:hAnsi="BRH Malayalam Extra" w:cs="BRH Malayalam Extra"/>
@@ -21980,27 +21028,7 @@
                 <w:sz w:val="32"/>
                 <w:szCs w:val="40"/>
               </w:rPr>
-              <w:t>)</w:t>
-            </w:r>
-            <w:proofErr w:type="gramStart"/>
-            <w:r>
-              <w:rPr>
-                <w:rFonts w:ascii="BRH Malayalam Extra" w:hAnsi="BRH Malayalam Extra" w:cs="BRH Malayalam Extra"/>
-                <w:color w:val="000000"/>
-                <w:sz w:val="32"/>
-                <w:szCs w:val="40"/>
-              </w:rPr>
-              <w:t>-  k</w:t>
-            </w:r>
-            <w:proofErr w:type="gramEnd"/>
-            <w:r>
-              <w:rPr>
-                <w:rFonts w:ascii="BRH Malayalam Extra" w:hAnsi="BRH Malayalam Extra" w:cs="BRH Malayalam Extra"/>
-                <w:color w:val="000000"/>
-                <w:sz w:val="32"/>
-                <w:szCs w:val="40"/>
-              </w:rPr>
-              <w:t>¡</w:t>
+              <w:t>)-  k¡</w:t>
             </w:r>
             <w:r>
               <w:rPr>
@@ -22457,19 +21485,8 @@
                 <w:sz w:val="32"/>
                 <w:szCs w:val="40"/>
               </w:rPr>
-              <w:t>)</w:t>
-            </w:r>
-            <w:proofErr w:type="gramStart"/>
-            <w:r>
-              <w:rPr>
-                <w:rFonts w:ascii="BRH Malayalam Extra" w:hAnsi="BRH Malayalam Extra" w:cs="BRH Malayalam Extra"/>
-                <w:color w:val="000000"/>
-                <w:sz w:val="32"/>
-                <w:szCs w:val="40"/>
-              </w:rPr>
-              <w:t>-  bûõ</w:t>
-            </w:r>
-            <w:proofErr w:type="gramEnd"/>
+              <w:t>)-  bûõ</w:t>
+            </w:r>
             <w:r>
               <w:rPr>
                 <w:rFonts w:ascii="BRH Malayalam Extra" w:hAnsi="BRH Malayalam Extra" w:cs="BRH Malayalam Extra"/>
@@ -22922,19 +21939,8 @@
                 <w:sz w:val="32"/>
                 <w:szCs w:val="40"/>
               </w:rPr>
-              <w:t>)</w:t>
-            </w:r>
-            <w:proofErr w:type="gramStart"/>
-            <w:r>
-              <w:rPr>
-                <w:rFonts w:ascii="BRH Malayalam Extra" w:hAnsi="BRH Malayalam Extra" w:cs="BRH Malayalam Extra"/>
-                <w:color w:val="000000"/>
-                <w:sz w:val="32"/>
-                <w:szCs w:val="40"/>
-              </w:rPr>
-              <w:t>-  bûõ</w:t>
-            </w:r>
-            <w:proofErr w:type="gramEnd"/>
+              <w:t>)-  bûõ</w:t>
+            </w:r>
             <w:r>
               <w:rPr>
                 <w:rFonts w:ascii="BRH Malayalam Extra" w:hAnsi="BRH Malayalam Extra" w:cs="BRH Malayalam Extra"/>
@@ -23220,19 +22226,8 @@
                 <w:sz w:val="32"/>
                 <w:szCs w:val="40"/>
               </w:rPr>
-              <w:t>)</w:t>
-            </w:r>
-            <w:proofErr w:type="gramStart"/>
-            <w:r>
-              <w:rPr>
-                <w:rFonts w:ascii="BRH Malayalam Extra" w:hAnsi="BRH Malayalam Extra" w:cs="BRH Malayalam Extra"/>
-                <w:color w:val="000000"/>
-                <w:sz w:val="32"/>
-                <w:szCs w:val="40"/>
-              </w:rPr>
-              <w:t>-  j</w:t>
-            </w:r>
-            <w:proofErr w:type="gramEnd"/>
+              <w:t>)-  j</w:t>
+            </w:r>
             <w:r>
               <w:rPr>
                 <w:rFonts w:ascii="BRH Malayalam Extra" w:hAnsi="BRH Malayalam Extra" w:cs="BRH Malayalam Extra"/>
@@ -23663,19 +22658,8 @@
                 <w:sz w:val="32"/>
                 <w:szCs w:val="40"/>
               </w:rPr>
-              <w:t>)</w:t>
-            </w:r>
-            <w:proofErr w:type="gramStart"/>
-            <w:r>
-              <w:rPr>
-                <w:rFonts w:ascii="BRH Malayalam Extra" w:hAnsi="BRH Malayalam Extra" w:cs="BRH Malayalam Extra"/>
-                <w:color w:val="000000"/>
-                <w:sz w:val="32"/>
-                <w:szCs w:val="40"/>
-              </w:rPr>
-              <w:t>-  j</w:t>
-            </w:r>
-            <w:proofErr w:type="gramEnd"/>
+              <w:t>)-  j</w:t>
+            </w:r>
             <w:r>
               <w:rPr>
                 <w:rFonts w:ascii="BRH Malayalam Extra" w:hAnsi="BRH Malayalam Extra" w:cs="BRH Malayalam Extra"/>
@@ -24112,27 +23096,7 @@
                 <w:sz w:val="32"/>
                 <w:szCs w:val="40"/>
               </w:rPr>
-              <w:t>)</w:t>
-            </w:r>
-            <w:proofErr w:type="gramStart"/>
-            <w:r>
-              <w:rPr>
-                <w:rFonts w:ascii="BRH Malayalam Extra" w:hAnsi="BRH Malayalam Extra" w:cs="BRH Malayalam Extra"/>
-                <w:color w:val="000000"/>
-                <w:sz w:val="32"/>
-                <w:szCs w:val="40"/>
-              </w:rPr>
-              <w:t>-  Apy</w:t>
-            </w:r>
-            <w:proofErr w:type="gramEnd"/>
-            <w:r>
-              <w:rPr>
-                <w:rFonts w:ascii="BRH Malayalam Extra" w:hAnsi="BRH Malayalam Extra" w:cs="BRH Malayalam Extra"/>
-                <w:color w:val="000000"/>
-                <w:sz w:val="32"/>
-                <w:szCs w:val="40"/>
-              </w:rPr>
-              <w:t>—btZx | q£</w:t>
+              <w:t>)-  Apy—btZx | q£</w:t>
             </w:r>
             <w:r>
               <w:rPr>
@@ -24422,27 +23386,7 @@
                 <w:sz w:val="32"/>
                 <w:szCs w:val="40"/>
               </w:rPr>
-              <w:t>)</w:t>
-            </w:r>
-            <w:proofErr w:type="gramStart"/>
-            <w:r>
-              <w:rPr>
-                <w:rFonts w:ascii="BRH Malayalam Extra" w:hAnsi="BRH Malayalam Extra" w:cs="BRH Malayalam Extra"/>
-                <w:color w:val="000000"/>
-                <w:sz w:val="32"/>
-                <w:szCs w:val="40"/>
-              </w:rPr>
-              <w:t>-  q</w:t>
-            </w:r>
-            <w:proofErr w:type="gramEnd"/>
-            <w:r>
-              <w:rPr>
-                <w:rFonts w:ascii="BRH Malayalam Extra" w:hAnsi="BRH Malayalam Extra" w:cs="BRH Malayalam Extra"/>
-                <w:color w:val="000000"/>
-                <w:sz w:val="32"/>
-                <w:szCs w:val="40"/>
-              </w:rPr>
-              <w:t>£</w:t>
+              <w:t>)-  q£</w:t>
             </w:r>
             <w:r>
               <w:rPr>
@@ -24863,27 +23807,7 @@
                 <w:sz w:val="32"/>
                 <w:szCs w:val="40"/>
               </w:rPr>
-              <w:t>)</w:t>
-            </w:r>
-            <w:proofErr w:type="gramStart"/>
-            <w:r>
-              <w:rPr>
-                <w:rFonts w:ascii="BRH Malayalam Extra" w:hAnsi="BRH Malayalam Extra" w:cs="BRH Malayalam Extra"/>
-                <w:color w:val="000000"/>
-                <w:sz w:val="32"/>
-                <w:szCs w:val="40"/>
-              </w:rPr>
-              <w:t>-  q</w:t>
-            </w:r>
-            <w:proofErr w:type="gramEnd"/>
-            <w:r>
-              <w:rPr>
-                <w:rFonts w:ascii="BRH Malayalam Extra" w:hAnsi="BRH Malayalam Extra" w:cs="BRH Malayalam Extra"/>
-                <w:color w:val="000000"/>
-                <w:sz w:val="32"/>
-                <w:szCs w:val="40"/>
-              </w:rPr>
-              <w:t>£</w:t>
+              <w:t>)-  q£</w:t>
             </w:r>
             <w:r>
               <w:rPr>
@@ -25127,27 +24051,7 @@
                 <w:sz w:val="32"/>
                 <w:szCs w:val="40"/>
               </w:rPr>
-              <w:t>)</w:t>
-            </w:r>
-            <w:proofErr w:type="gramStart"/>
-            <w:r>
-              <w:rPr>
-                <w:rFonts w:ascii="BRH Malayalam Extra" w:hAnsi="BRH Malayalam Extra" w:cs="BRH Malayalam Extra"/>
-                <w:color w:val="000000"/>
-                <w:sz w:val="32"/>
-                <w:szCs w:val="40"/>
-              </w:rPr>
-              <w:t>-  Apy</w:t>
-            </w:r>
-            <w:proofErr w:type="gramEnd"/>
-            <w:r>
-              <w:rPr>
-                <w:rFonts w:ascii="BRH Malayalam Extra" w:hAnsi="BRH Malayalam Extra" w:cs="BRH Malayalam Extra"/>
-                <w:color w:val="000000"/>
-                <w:sz w:val="32"/>
-                <w:szCs w:val="40"/>
-              </w:rPr>
-              <w:t>—btZx | q£</w:t>
+              <w:t>)-  Apy—btZx | q£</w:t>
             </w:r>
             <w:r>
               <w:rPr>
@@ -25538,27 +24442,7 @@
                 <w:sz w:val="32"/>
                 <w:szCs w:val="40"/>
               </w:rPr>
-              <w:t>)</w:t>
-            </w:r>
-            <w:proofErr w:type="gramStart"/>
-            <w:r>
-              <w:rPr>
-                <w:rFonts w:ascii="BRH Malayalam Extra" w:hAnsi="BRH Malayalam Extra" w:cs="BRH Malayalam Extra"/>
-                <w:color w:val="000000"/>
-                <w:sz w:val="32"/>
-                <w:szCs w:val="40"/>
-              </w:rPr>
-              <w:t>-  q</w:t>
-            </w:r>
-            <w:proofErr w:type="gramEnd"/>
-            <w:r>
-              <w:rPr>
-                <w:rFonts w:ascii="BRH Malayalam Extra" w:hAnsi="BRH Malayalam Extra" w:cs="BRH Malayalam Extra"/>
-                <w:color w:val="000000"/>
-                <w:sz w:val="32"/>
-                <w:szCs w:val="40"/>
-              </w:rPr>
-              <w:t>£</w:t>
+              <w:t>)-  q£</w:t>
             </w:r>
             <w:r>
               <w:rPr>
@@ -26071,27 +24955,7 @@
                 <w:sz w:val="32"/>
                 <w:szCs w:val="40"/>
               </w:rPr>
-              <w:t>)</w:t>
-            </w:r>
-            <w:proofErr w:type="gramStart"/>
-            <w:r>
-              <w:rPr>
-                <w:rFonts w:ascii="BRH Malayalam Extra" w:hAnsi="BRH Malayalam Extra" w:cs="BRH Malayalam Extra"/>
-                <w:color w:val="000000"/>
-                <w:sz w:val="32"/>
-                <w:szCs w:val="40"/>
-              </w:rPr>
-              <w:t>-  q</w:t>
-            </w:r>
-            <w:proofErr w:type="gramEnd"/>
-            <w:r>
-              <w:rPr>
-                <w:rFonts w:ascii="BRH Malayalam Extra" w:hAnsi="BRH Malayalam Extra" w:cs="BRH Malayalam Extra"/>
-                <w:color w:val="000000"/>
-                <w:sz w:val="32"/>
-                <w:szCs w:val="40"/>
-              </w:rPr>
-              <w:t>£</w:t>
+              <w:t>)-  q£</w:t>
             </w:r>
             <w:r>
               <w:rPr>
@@ -26387,27 +25251,7 @@
                 <w:sz w:val="32"/>
                 <w:szCs w:val="40"/>
               </w:rPr>
-              <w:t>)</w:t>
-            </w:r>
-            <w:proofErr w:type="gramStart"/>
-            <w:r>
-              <w:rPr>
-                <w:rFonts w:ascii="BRH Malayalam Extra" w:hAnsi="BRH Malayalam Extra" w:cs="BRH Malayalam Extra"/>
-                <w:color w:val="000000"/>
-                <w:sz w:val="32"/>
-                <w:szCs w:val="40"/>
-              </w:rPr>
-              <w:t>-  ¥</w:t>
-            </w:r>
-            <w:proofErr w:type="gramEnd"/>
-            <w:r>
-              <w:rPr>
-                <w:rFonts w:ascii="BRH Malayalam Extra" w:hAnsi="BRH Malayalam Extra" w:cs="BRH Malayalam Extra"/>
-                <w:color w:val="000000"/>
-                <w:sz w:val="32"/>
-                <w:szCs w:val="40"/>
-              </w:rPr>
-              <w:t>b</w:t>
+              <w:t>)-  ¥b</w:t>
             </w:r>
             <w:r>
               <w:rPr>
@@ -26815,27 +25659,7 @@
                 <w:sz w:val="32"/>
                 <w:szCs w:val="40"/>
               </w:rPr>
-              <w:t>)</w:t>
-            </w:r>
-            <w:proofErr w:type="gramStart"/>
-            <w:r>
-              <w:rPr>
-                <w:rFonts w:ascii="BRH Malayalam Extra" w:hAnsi="BRH Malayalam Extra" w:cs="BRH Malayalam Extra"/>
-                <w:color w:val="000000"/>
-                <w:sz w:val="32"/>
-                <w:szCs w:val="40"/>
-              </w:rPr>
-              <w:t>-  ¥</w:t>
-            </w:r>
-            <w:proofErr w:type="gramEnd"/>
-            <w:r>
-              <w:rPr>
-                <w:rFonts w:ascii="BRH Malayalam Extra" w:hAnsi="BRH Malayalam Extra" w:cs="BRH Malayalam Extra"/>
-                <w:color w:val="000000"/>
-                <w:sz w:val="32"/>
-                <w:szCs w:val="40"/>
-              </w:rPr>
-              <w:t>b</w:t>
+              <w:t>)-  ¥b</w:t>
             </w:r>
             <w:r>
               <w:rPr>
@@ -26959,30 +25783,129 @@
                 <w:szCs w:val="40"/>
                 <w:highlight w:val="green"/>
               </w:rPr>
-              <w:t>(³</w:t>
-            </w:r>
-            <w:proofErr w:type="gramStart"/>
-            <w:r>
-              <w:rPr>
-                <w:rFonts w:ascii="BRH Malayalam Extra" w:hAnsi="BRH Malayalam Extra" w:cs="BRH Malayalam Extra"/>
-                <w:color w:val="000000"/>
-                <w:sz w:val="32"/>
+              <w:t>(³§)</w:t>
+            </w:r>
+            <w:r>
+              <w:rPr>
+                <w:rFonts w:ascii="BRH Malayalam Extra" w:hAnsi="BRH Malayalam Extra" w:cs="BRH Malayalam Extra"/>
+                <w:color w:val="000000"/>
+                <w:sz w:val="26"/>
                 <w:szCs w:val="40"/>
                 <w:highlight w:val="green"/>
               </w:rPr>
-              <w:t>§)</w:t>
-            </w:r>
-            <w:r>
-              <w:rPr>
-                <w:rFonts w:ascii="BRH Malayalam Extra" w:hAnsi="BRH Malayalam Extra" w:cs="BRH Malayalam Extra"/>
-                <w:color w:val="000000"/>
-                <w:sz w:val="26"/>
+              <w:t>––</w:t>
+            </w:r>
+            <w:r>
+              <w:rPr>
+                <w:rFonts w:ascii="BRH Malayalam Extra" w:hAnsi="BRH Malayalam Extra" w:cs="BRH Malayalam Extra"/>
+                <w:color w:val="000000"/>
+                <w:sz w:val="32"/>
                 <w:szCs w:val="40"/>
                 <w:highlight w:val="green"/>
               </w:rPr>
+              <w:t xml:space="preserve"> A</w:t>
+            </w:r>
+            <w:r>
+              <w:rPr>
+                <w:rFonts w:ascii="BRH Malayalam Extra" w:hAnsi="BRH Malayalam Extra" w:cs="BRH Malayalam Extra"/>
+                <w:color w:val="000000"/>
+                <w:sz w:val="32"/>
+                <w:szCs w:val="40"/>
+              </w:rPr>
+              <w:t>qûx</w:t>
+            </w:r>
+            <w:r>
+              <w:rPr>
+                <w:rFonts w:ascii="BRH Malayalam Extra" w:hAnsi="BRH Malayalam Extra" w:cs="BRH Malayalam Extra"/>
+                <w:color w:val="000000"/>
+                <w:sz w:val="26"/>
+                <w:szCs w:val="40"/>
+              </w:rPr>
+              <w:t>–</w:t>
+            </w:r>
+            <w:r>
+              <w:rPr>
+                <w:rFonts w:ascii="BRH Malayalam Extra" w:hAnsi="BRH Malayalam Extra" w:cs="BRH Malayalam Extra"/>
+                <w:color w:val="000000"/>
+                <w:sz w:val="32"/>
+                <w:szCs w:val="40"/>
+              </w:rPr>
+              <w:t>(³§)</w:t>
+            </w:r>
+            <w:r>
+              <w:rPr>
+                <w:rFonts w:ascii="BRH Malayalam Extra" w:hAnsi="BRH Malayalam Extra" w:cs="BRH Malayalam Extra"/>
+                <w:color w:val="000000"/>
+                <w:sz w:val="26"/>
+                <w:szCs w:val="40"/>
+              </w:rPr>
+              <w:t>–</w:t>
+            </w:r>
+            <w:r>
+              <w:rPr>
+                <w:rFonts w:ascii="BRH Malayalam Extra" w:hAnsi="BRH Malayalam Extra" w:cs="BRH Malayalam Extra"/>
+                <w:color w:val="000000"/>
+                <w:sz w:val="32"/>
+                <w:szCs w:val="40"/>
+              </w:rPr>
+              <w:t xml:space="preserve"> Aqûx˜© ¥bp</w:t>
+            </w:r>
+            <w:r>
+              <w:rPr>
+                <w:rFonts w:ascii="BRH Malayalam Extra" w:hAnsi="BRH Malayalam Extra" w:cs="BRH Malayalam Extra"/>
+                <w:color w:val="000000"/>
+                <w:sz w:val="26"/>
+                <w:szCs w:val="40"/>
+              </w:rPr>
+              <w:t>–</w:t>
+            </w:r>
+            <w:r>
+              <w:rPr>
+                <w:rFonts w:ascii="BRH Malayalam Extra" w:hAnsi="BRH Malayalam Extra" w:cs="BRH Malayalam Extra"/>
+                <w:color w:val="000000"/>
+                <w:sz w:val="32"/>
+                <w:szCs w:val="40"/>
+              </w:rPr>
+              <w:t>t¢Z—ix© ¥bp</w:t>
+            </w:r>
+            <w:r>
+              <w:rPr>
+                <w:rFonts w:ascii="BRH Malayalam Extra" w:hAnsi="BRH Malayalam Extra" w:cs="BRH Malayalam Extra"/>
+                <w:color w:val="000000"/>
+                <w:sz w:val="26"/>
+                <w:szCs w:val="40"/>
+              </w:rPr>
+              <w:t>–</w:t>
+            </w:r>
+            <w:r>
+              <w:rPr>
+                <w:rFonts w:ascii="BRH Malayalam Extra" w:hAnsi="BRH Malayalam Extra" w:cs="BRH Malayalam Extra"/>
+                <w:color w:val="000000"/>
+                <w:sz w:val="32"/>
+                <w:szCs w:val="40"/>
+              </w:rPr>
+              <w:t>t¢Z</w:t>
+            </w:r>
+            <w:r>
+              <w:rPr>
+                <w:rFonts w:ascii="BRH Malayalam Extra" w:hAnsi="BRH Malayalam Extra" w:cs="BRH Malayalam Extra"/>
+                <w:color w:val="000000"/>
+                <w:sz w:val="32"/>
+                <w:szCs w:val="40"/>
+                <w:highlight w:val="green"/>
+              </w:rPr>
+              <w:t>—ix</w:t>
+            </w:r>
+            <w:r>
+              <w:rPr>
+                <w:rFonts w:ascii="BRH Malayalam Extra" w:hAnsi="BRH Malayalam Extra" w:cs="BRH Malayalam Extra"/>
+                <w:color w:val="000000"/>
+                <w:sz w:val="26"/>
+                <w:szCs w:val="40"/>
+                <w:highlight w:val="green"/>
+              </w:rPr>
               <w:t>––</w:t>
             </w:r>
-            <w:proofErr w:type="gramEnd"/>
             <w:r>
               <w:rPr>
                 <w:rFonts w:ascii="BRH Malayalam Extra" w:hAnsi="BRH Malayalam Extra" w:cs="BRH Malayalam Extra"/>
@@ -26991,33 +25914,6 @@
                 <w:szCs w:val="40"/>
                 <w:highlight w:val="green"/>
               </w:rPr>
-              <w:t xml:space="preserve"> A</w:t>
-            </w:r>
-            <w:r>
-              <w:rPr>
-                <w:rFonts w:ascii="BRH Malayalam Extra" w:hAnsi="BRH Malayalam Extra" w:cs="BRH Malayalam Extra"/>
-                <w:color w:val="000000"/>
-                <w:sz w:val="32"/>
-                <w:szCs w:val="40"/>
-              </w:rPr>
-              <w:t>qûx</w:t>
-            </w:r>
-            <w:r>
-              <w:rPr>
-                <w:rFonts w:ascii="BRH Malayalam Extra" w:hAnsi="BRH Malayalam Extra" w:cs="BRH Malayalam Extra"/>
-                <w:color w:val="000000"/>
-                <w:sz w:val="26"/>
-                <w:szCs w:val="40"/>
-              </w:rPr>
-              <w:t>–</w:t>
-            </w:r>
-            <w:r>
-              <w:rPr>
-                <w:rFonts w:ascii="BRH Malayalam Extra" w:hAnsi="BRH Malayalam Extra" w:cs="BRH Malayalam Extra"/>
-                <w:color w:val="000000"/>
-                <w:sz w:val="32"/>
-                <w:szCs w:val="40"/>
-              </w:rPr>
               <w:t>(³§)</w:t>
             </w:r>
             <w:r>
@@ -27026,106 +25922,10 @@
                 <w:color w:val="000000"/>
                 <w:sz w:val="26"/>
                 <w:szCs w:val="40"/>
-              </w:rPr>
-              <w:t>–</w:t>
-            </w:r>
-            <w:r>
-              <w:rPr>
-                <w:rFonts w:ascii="BRH Malayalam Extra" w:hAnsi="BRH Malayalam Extra" w:cs="BRH Malayalam Extra"/>
-                <w:color w:val="000000"/>
-                <w:sz w:val="32"/>
-                <w:szCs w:val="40"/>
-              </w:rPr>
-              <w:t xml:space="preserve"> Aqûx˜© ¥bp</w:t>
-            </w:r>
-            <w:r>
-              <w:rPr>
-                <w:rFonts w:ascii="BRH Malayalam Extra" w:hAnsi="BRH Malayalam Extra" w:cs="BRH Malayalam Extra"/>
-                <w:color w:val="000000"/>
-                <w:sz w:val="26"/>
-                <w:szCs w:val="40"/>
-              </w:rPr>
-              <w:t>–</w:t>
-            </w:r>
-            <w:r>
-              <w:rPr>
-                <w:rFonts w:ascii="BRH Malayalam Extra" w:hAnsi="BRH Malayalam Extra" w:cs="BRH Malayalam Extra"/>
-                <w:color w:val="000000"/>
-                <w:sz w:val="32"/>
-                <w:szCs w:val="40"/>
-              </w:rPr>
-              <w:t>t¢Z—ix© ¥bp</w:t>
-            </w:r>
-            <w:r>
-              <w:rPr>
-                <w:rFonts w:ascii="BRH Malayalam Extra" w:hAnsi="BRH Malayalam Extra" w:cs="BRH Malayalam Extra"/>
-                <w:color w:val="000000"/>
-                <w:sz w:val="26"/>
-                <w:szCs w:val="40"/>
-              </w:rPr>
-              <w:t>–</w:t>
-            </w:r>
-            <w:r>
-              <w:rPr>
-                <w:rFonts w:ascii="BRH Malayalam Extra" w:hAnsi="BRH Malayalam Extra" w:cs="BRH Malayalam Extra"/>
-                <w:color w:val="000000"/>
-                <w:sz w:val="32"/>
-                <w:szCs w:val="40"/>
-              </w:rPr>
-              <w:t>t¢Z</w:t>
-            </w:r>
-            <w:r>
-              <w:rPr>
-                <w:rFonts w:ascii="BRH Malayalam Extra" w:hAnsi="BRH Malayalam Extra" w:cs="BRH Malayalam Extra"/>
-                <w:color w:val="000000"/>
-                <w:sz w:val="32"/>
-                <w:szCs w:val="40"/>
                 <w:highlight w:val="green"/>
               </w:rPr>
-              <w:t>—ix</w:t>
-            </w:r>
-            <w:r>
-              <w:rPr>
-                <w:rFonts w:ascii="BRH Malayalam Extra" w:hAnsi="BRH Malayalam Extra" w:cs="BRH Malayalam Extra"/>
-                <w:color w:val="000000"/>
-                <w:sz w:val="26"/>
-                <w:szCs w:val="40"/>
-                <w:highlight w:val="green"/>
-              </w:rPr>
               <w:t>––</w:t>
             </w:r>
-            <w:r>
-              <w:rPr>
-                <w:rFonts w:ascii="BRH Malayalam Extra" w:hAnsi="BRH Malayalam Extra" w:cs="BRH Malayalam Extra"/>
-                <w:color w:val="000000"/>
-                <w:sz w:val="32"/>
-                <w:szCs w:val="40"/>
-                <w:highlight w:val="green"/>
-              </w:rPr>
-              <w:t>(³</w:t>
-            </w:r>
-            <w:proofErr w:type="gramStart"/>
-            <w:r>
-              <w:rPr>
-                <w:rFonts w:ascii="BRH Malayalam Extra" w:hAnsi="BRH Malayalam Extra" w:cs="BRH Malayalam Extra"/>
-                <w:color w:val="000000"/>
-                <w:sz w:val="32"/>
-                <w:szCs w:val="40"/>
-                <w:highlight w:val="green"/>
-              </w:rPr>
-              <w:t>§)</w:t>
-            </w:r>
-            <w:r>
-              <w:rPr>
-                <w:rFonts w:ascii="BRH Malayalam Extra" w:hAnsi="BRH Malayalam Extra" w:cs="BRH Malayalam Extra"/>
-                <w:color w:val="000000"/>
-                <w:sz w:val="26"/>
-                <w:szCs w:val="40"/>
-                <w:highlight w:val="green"/>
-              </w:rPr>
-              <w:t>––</w:t>
-            </w:r>
-            <w:proofErr w:type="gramEnd"/>
             <w:r>
               <w:rPr>
                 <w:rFonts w:ascii="BRH Malayalam Extra" w:hAnsi="BRH Malayalam Extra" w:cs="BRH Malayalam Extra"/>
@@ -27288,19 +26088,8 @@
                 <w:sz w:val="32"/>
                 <w:szCs w:val="40"/>
               </w:rPr>
-              <w:t>)</w:t>
-            </w:r>
-            <w:proofErr w:type="gramStart"/>
-            <w:r>
-              <w:rPr>
-                <w:rFonts w:ascii="BRH Malayalam Extra" w:hAnsi="BRH Malayalam Extra" w:cs="BRH Malayalam Extra"/>
-                <w:color w:val="000000"/>
-                <w:sz w:val="32"/>
-                <w:szCs w:val="40"/>
-              </w:rPr>
-              <w:t>-  j</w:t>
-            </w:r>
-            <w:proofErr w:type="gramEnd"/>
+              <w:t>)-  j</w:t>
+            </w:r>
             <w:r>
               <w:rPr>
                 <w:rFonts w:ascii="BRH Malayalam Extra" w:hAnsi="BRH Malayalam Extra" w:cs="BRH Malayalam Extra"/>
@@ -27525,19 +26314,8 @@
                 <w:sz w:val="32"/>
                 <w:szCs w:val="40"/>
               </w:rPr>
-              <w:t>)</w:t>
-            </w:r>
-            <w:proofErr w:type="gramStart"/>
-            <w:r>
-              <w:rPr>
-                <w:rFonts w:ascii="BRH Malayalam Extra" w:hAnsi="BRH Malayalam Extra" w:cs="BRH Malayalam Extra"/>
-                <w:color w:val="000000"/>
-                <w:sz w:val="32"/>
-                <w:szCs w:val="40"/>
-              </w:rPr>
-              <w:t>-  j</w:t>
-            </w:r>
-            <w:proofErr w:type="gramEnd"/>
+              <w:t>)-  j</w:t>
+            </w:r>
             <w:r>
               <w:rPr>
                 <w:rFonts w:ascii="BRH Malayalam Extra" w:hAnsi="BRH Malayalam Extra" w:cs="BRH Malayalam Extra"/>
@@ -27776,19 +26554,8 @@
                 <w:sz w:val="32"/>
                 <w:szCs w:val="40"/>
               </w:rPr>
-              <w:t>)</w:t>
-            </w:r>
-            <w:proofErr w:type="gramStart"/>
-            <w:r>
-              <w:rPr>
-                <w:rFonts w:ascii="BRH Malayalam Extra" w:hAnsi="BRH Malayalam Extra" w:cs="BRH Malayalam Extra"/>
-                <w:color w:val="000000"/>
-                <w:sz w:val="32"/>
-                <w:szCs w:val="40"/>
-              </w:rPr>
-              <w:t>-  öe</w:t>
-            </w:r>
-            <w:proofErr w:type="gramEnd"/>
+              <w:t>)-  öe</w:t>
+            </w:r>
             <w:r>
               <w:rPr>
                 <w:rFonts w:ascii="BRH Malayalam Extra" w:hAnsi="BRH Malayalam Extra" w:cs="BRH Malayalam Extra"/>
@@ -28055,19 +26822,8 @@
                 <w:sz w:val="32"/>
                 <w:szCs w:val="40"/>
               </w:rPr>
-              <w:t>)</w:t>
-            </w:r>
-            <w:proofErr w:type="gramStart"/>
-            <w:r>
-              <w:rPr>
-                <w:rFonts w:ascii="BRH Malayalam Extra" w:hAnsi="BRH Malayalam Extra" w:cs="BRH Malayalam Extra"/>
-                <w:color w:val="000000"/>
-                <w:sz w:val="32"/>
-                <w:szCs w:val="40"/>
-              </w:rPr>
-              <w:t>-  öe</w:t>
-            </w:r>
-            <w:proofErr w:type="gramEnd"/>
+              <w:t>)-  öe</w:t>
+            </w:r>
             <w:r>
               <w:rPr>
                 <w:rFonts w:ascii="BRH Malayalam Extra" w:hAnsi="BRH Malayalam Extra" w:cs="BRH Malayalam Extra"/>
@@ -28341,19 +27097,8 @@
                 <w:sz w:val="32"/>
                 <w:szCs w:val="40"/>
               </w:rPr>
-              <w:t>)</w:t>
-            </w:r>
-            <w:proofErr w:type="gramStart"/>
-            <w:r>
-              <w:rPr>
-                <w:rFonts w:ascii="BRH Malayalam Extra" w:hAnsi="BRH Malayalam Extra" w:cs="BRH Malayalam Extra"/>
-                <w:color w:val="000000"/>
-                <w:sz w:val="32"/>
-                <w:szCs w:val="40"/>
-              </w:rPr>
-              <w:t>-  C</w:t>
-            </w:r>
-            <w:proofErr w:type="gramEnd"/>
+              <w:t>)-  C</w:t>
+            </w:r>
             <w:r>
               <w:rPr>
                 <w:rFonts w:ascii="BRH Malayalam Extra" w:hAnsi="BRH Malayalam Extra" w:cs="BRH Malayalam Extra"/>
@@ -28596,19 +27341,8 @@
                 <w:sz w:val="32"/>
                 <w:szCs w:val="40"/>
               </w:rPr>
-              <w:t>)</w:t>
-            </w:r>
-            <w:proofErr w:type="gramStart"/>
-            <w:r>
-              <w:rPr>
-                <w:rFonts w:ascii="BRH Malayalam Extra" w:hAnsi="BRH Malayalam Extra" w:cs="BRH Malayalam Extra"/>
-                <w:color w:val="000000"/>
-                <w:sz w:val="32"/>
-                <w:szCs w:val="40"/>
-              </w:rPr>
-              <w:t>-  C</w:t>
-            </w:r>
-            <w:proofErr w:type="gramEnd"/>
+              <w:t>)-  C</w:t>
+            </w:r>
             <w:r>
               <w:rPr>
                 <w:rFonts w:ascii="BRH Malayalam Extra" w:hAnsi="BRH Malayalam Extra" w:cs="BRH Malayalam Extra"/>
@@ -28856,19 +27590,8 @@
                 <w:sz w:val="32"/>
                 <w:szCs w:val="40"/>
               </w:rPr>
-              <w:t>)</w:t>
-            </w:r>
-            <w:proofErr w:type="gramStart"/>
-            <w:r>
-              <w:rPr>
-                <w:rFonts w:ascii="BRH Malayalam Extra" w:hAnsi="BRH Malayalam Extra" w:cs="BRH Malayalam Extra"/>
-                <w:color w:val="000000"/>
-                <w:sz w:val="32"/>
-                <w:szCs w:val="40"/>
-              </w:rPr>
-              <w:t>-  C</w:t>
-            </w:r>
-            <w:proofErr w:type="gramEnd"/>
+              <w:t>)-  C</w:t>
+            </w:r>
             <w:r>
               <w:rPr>
                 <w:rFonts w:ascii="BRH Malayalam Extra" w:hAnsi="BRH Malayalam Extra" w:cs="BRH Malayalam Extra"/>
@@ -29111,19 +27834,8 @@
                 <w:sz w:val="32"/>
                 <w:szCs w:val="40"/>
               </w:rPr>
-              <w:t>)</w:t>
-            </w:r>
-            <w:proofErr w:type="gramStart"/>
-            <w:r>
-              <w:rPr>
-                <w:rFonts w:ascii="BRH Malayalam Extra" w:hAnsi="BRH Malayalam Extra" w:cs="BRH Malayalam Extra"/>
-                <w:color w:val="000000"/>
-                <w:sz w:val="32"/>
-                <w:szCs w:val="40"/>
-              </w:rPr>
-              <w:t>-  C</w:t>
-            </w:r>
-            <w:proofErr w:type="gramEnd"/>
+              <w:t>)-  C</w:t>
+            </w:r>
             <w:r>
               <w:rPr>
                 <w:rFonts w:ascii="BRH Malayalam Extra" w:hAnsi="BRH Malayalam Extra" w:cs="BRH Malayalam Extra"/>
@@ -29707,7 +28419,7 @@
 </file>
 
 <file path=word/endnotes.xml><?xml version="1.0" encoding="utf-8"?>
-<w:endnotes xmlns:wpc="http://schemas.microsoft.com/office/word/2010/wordprocessingCanvas" xmlns:cx="http://schemas.microsoft.com/office/drawing/2014/chartex" xmlns:cx1="http://schemas.microsoft.com/office/drawing/2015/9/8/chartex" xmlns:cx2="http://schemas.microsoft.com/office/drawing/2015/10/21/chartex" xmlns:cx3="http://schemas.microsoft.com/office/drawing/2016/5/9/chartex" xmlns:cx4="http://schemas.microsoft.com/office/drawing/2016/5/10/chartex" xmlns:cx5="http://schemas.microsoft.com/office/drawing/2016/5/11/chartex" xmlns:cx6="http://schemas.microsoft.com/office/drawing/2016/5/12/chartex" xmlns:cx7="http://schemas.microsoft.com/office/drawing/2016/5/13/chartex" xmlns:cx8="http://schemas.microsoft.com/office/drawing/2016/5/14/chartex" xmlns:mc="http://schemas.openxmlformats.org/markup-compatibility/2006" xmlns:aink="http://schemas.microsoft.com/office/drawing/2016/ink" xmlns:am3d="http://schemas.microsoft.com/office/drawing/2017/model3d" xmlns:o="urn:schemas-microsoft-com:office:office" xmlns:oel="http://schemas.microsoft.com/office/2019/extlst" xmlns:r="http://schemas.openxmlformats.org/officeDocument/2006/relationships" xmlns:m="http://schemas.openxmlformats.org/officeDocument/2006/math" xmlns:v="urn:schemas-microsoft-com:vml" xmlns:wp14="http://schemas.microsoft.com/office/word/2010/wordprocessingDrawing" xmlns:wp="http://schemas.openxmlformats.org/drawingml/2006/wordprocessingDrawing" xmlns:w10="urn:schemas-microsoft-com:office:word" xmlns:w="http://schemas.openxmlformats.org/wordprocessingml/2006/main" xmlns:w14="http://schemas.microsoft.com/office/word/2010/wordml" xmlns:w15="http://schemas.microsoft.com/office/word/2012/wordml" xmlns:w16cex="http://schemas.microsoft.com/office/word/2018/wordml/cex" xmlns:w16cid="http://schemas.microsoft.com/office/word/2016/wordml/cid" xmlns:w16="http://schemas.microsoft.com/office/word/2018/wordml" xmlns:w16du="http://schemas.microsoft.com/office/word/2023/wordml/word16du" xmlns:w16sdtdh="http://schemas.microsoft.com/office/word/2020/wordml/sdtdatahash" xmlns:w16sdtfl="http://schemas.microsoft.com/office/word/2024/wordml/sdtformatlock" xmlns:w16se="http://schemas.microsoft.com/office/word/2015/wordml/symex" xmlns:wpg="http://schemas.microsoft.com/office/word/2010/wordprocessingGroup" xmlns:wpi="http://schemas.microsoft.com/office/word/2010/wordprocessingInk" xmlns:wne="http://schemas.microsoft.com/office/word/2006/wordml" xmlns:wps="http://schemas.microsoft.com/office/word/2010/wordprocessingShape" mc:Ignorable="w14 w15 w16se w16cid w16 w16cex w16sdtdh w16sdtfl w16du wp14">
+<w:endnotes xmlns:wpc="http://schemas.microsoft.com/office/word/2010/wordprocessingCanvas" xmlns:cx="http://schemas.microsoft.com/office/drawing/2014/chartex" xmlns:cx1="http://schemas.microsoft.com/office/drawing/2015/9/8/chartex" xmlns:cx2="http://schemas.microsoft.com/office/drawing/2015/10/21/chartex" xmlns:cx3="http://schemas.microsoft.com/office/drawing/2016/5/9/chartex" xmlns:cx4="http://schemas.microsoft.com/office/drawing/2016/5/10/chartex" xmlns:cx5="http://schemas.microsoft.com/office/drawing/2016/5/11/chartex" xmlns:cx6="http://schemas.microsoft.com/office/drawing/2016/5/12/chartex" xmlns:cx7="http://schemas.microsoft.com/office/drawing/2016/5/13/chartex" xmlns:cx8="http://schemas.microsoft.com/office/drawing/2016/5/14/chartex" xmlns:mc="http://schemas.openxmlformats.org/markup-compatibility/2006" xmlns:aink="http://schemas.microsoft.com/office/drawing/2016/ink" xmlns:am3d="http://schemas.microsoft.com/office/drawing/2017/model3d" xmlns:o="urn:schemas-microsoft-com:office:office" xmlns:oel="http://schemas.microsoft.com/office/2019/extlst" xmlns:r="http://schemas.openxmlformats.org/officeDocument/2006/relationships" xmlns:m="http://schemas.openxmlformats.org/officeDocument/2006/math" xmlns:v="urn:schemas-microsoft-com:vml" xmlns:wp14="http://schemas.microsoft.com/office/word/2010/wordprocessingDrawing" xmlns:wp="http://schemas.openxmlformats.org/drawingml/2006/wordprocessingDrawing" xmlns:w10="urn:schemas-microsoft-com:office:word" xmlns:w="http://schemas.openxmlformats.org/wordprocessingml/2006/main" xmlns:w14="http://schemas.microsoft.com/office/word/2010/wordml" xmlns:w15="http://schemas.microsoft.com/office/word/2012/wordml" xmlns:w16cei="http://schemas.microsoft.com/office/word/2026/wordml/cei" xmlns:w16cex="http://schemas.microsoft.com/office/word/2018/wordml/cex" xmlns:w16cid="http://schemas.microsoft.com/office/word/2016/wordml/cid" xmlns:w16="http://schemas.microsoft.com/office/word/2018/wordml" xmlns:w16du="http://schemas.microsoft.com/office/word/2023/wordml/word16du" xmlns:w16sdtdh="http://schemas.microsoft.com/office/word/2020/wordml/sdtdatahash" xmlns:w16sdtfl="http://schemas.microsoft.com/office/word/2024/wordml/sdtformatlock" xmlns:w16se="http://schemas.microsoft.com/office/word/2015/wordml/symex" xmlns:wpg="http://schemas.microsoft.com/office/word/2010/wordprocessingGroup" xmlns:wpi="http://schemas.microsoft.com/office/word/2010/wordprocessingInk" xmlns:wne="http://schemas.microsoft.com/office/word/2006/wordml" xmlns:wps="http://schemas.microsoft.com/office/word/2010/wordprocessingShape" mc:Ignorable="w14 w15 w16se w16cid w16 w16cex w16sdtdh w16sdtfl w16du wp14">
   <w:endnote w:type="separator" w:id="-1">
     <w:p>
       <w:pPr>
@@ -29732,7 +28444,7 @@
 </file>
 
 <file path=word/footer1.xml><?xml version="1.0" encoding="utf-8"?>
-<w:ftr xmlns:wpc="http://schemas.microsoft.com/office/word/2010/wordprocessingCanvas" xmlns:cx="http://schemas.microsoft.com/office/drawing/2014/chartex" xmlns:cx1="http://schemas.microsoft.com/office/drawing/2015/9/8/chartex" xmlns:cx2="http://schemas.microsoft.com/office/drawing/2015/10/21/chartex" xmlns:cx3="http://schemas.microsoft.com/office/drawing/2016/5/9/chartex" xmlns:cx4="http://schemas.microsoft.com/office/drawing/2016/5/10/chartex" xmlns:cx5="http://schemas.microsoft.com/office/drawing/2016/5/11/chartex" xmlns:cx6="http://schemas.microsoft.com/office/drawing/2016/5/12/chartex" xmlns:cx7="http://schemas.microsoft.com/office/drawing/2016/5/13/chartex" xmlns:cx8="http://schemas.microsoft.com/office/drawing/2016/5/14/chartex" xmlns:mc="http://schemas.openxmlformats.org/markup-compatibility/2006" xmlns:aink="http://schemas.microsoft.com/office/drawing/2016/ink" xmlns:am3d="http://schemas.microsoft.com/office/drawing/2017/model3d" xmlns:o="urn:schemas-microsoft-com:office:office" xmlns:oel="http://schemas.microsoft.com/office/2019/extlst" xmlns:r="http://schemas.openxmlformats.org/officeDocument/2006/relationships" xmlns:m="http://schemas.openxmlformats.org/officeDocument/2006/math" xmlns:v="urn:schemas-microsoft-com:vml" xmlns:wp14="http://schemas.microsoft.com/office/word/2010/wordprocessingDrawing" xmlns:wp="http://schemas.openxmlformats.org/drawingml/2006/wordprocessingDrawing" xmlns:w10="urn:schemas-microsoft-com:office:word" xmlns:w="http://schemas.openxmlformats.org/wordprocessingml/2006/main" xmlns:w14="http://schemas.microsoft.com/office/word/2010/wordml" xmlns:w15="http://schemas.microsoft.com/office/word/2012/wordml" xmlns:w16cex="http://schemas.microsoft.com/office/word/2018/wordml/cex" xmlns:w16cid="http://schemas.microsoft.com/office/word/2016/wordml/cid" xmlns:w16="http://schemas.microsoft.com/office/word/2018/wordml" xmlns:w16du="http://schemas.microsoft.com/office/word/2023/wordml/word16du" xmlns:w16sdtdh="http://schemas.microsoft.com/office/word/2020/wordml/sdtdatahash" xmlns:w16sdtfl="http://schemas.microsoft.com/office/word/2024/wordml/sdtformatlock" xmlns:w16se="http://schemas.microsoft.com/office/word/2015/wordml/symex" xmlns:wpg="http://schemas.microsoft.com/office/word/2010/wordprocessingGroup" xmlns:wpi="http://schemas.microsoft.com/office/word/2010/wordprocessingInk" xmlns:wne="http://schemas.microsoft.com/office/word/2006/wordml" xmlns:wps="http://schemas.microsoft.com/office/word/2010/wordprocessingShape" mc:Ignorable="w14 w15 w16se w16cid w16 w16cex w16sdtdh w16sdtfl w16du wp14">
+<w:ftr xmlns:wpc="http://schemas.microsoft.com/office/word/2010/wordprocessingCanvas" xmlns:cx="http://schemas.microsoft.com/office/drawing/2014/chartex" xmlns:cx1="http://schemas.microsoft.com/office/drawing/2015/9/8/chartex" xmlns:cx2="http://schemas.microsoft.com/office/drawing/2015/10/21/chartex" xmlns:cx3="http://schemas.microsoft.com/office/drawing/2016/5/9/chartex" xmlns:cx4="http://schemas.microsoft.com/office/drawing/2016/5/10/chartex" xmlns:cx5="http://schemas.microsoft.com/office/drawing/2016/5/11/chartex" xmlns:cx6="http://schemas.microsoft.com/office/drawing/2016/5/12/chartex" xmlns:cx7="http://schemas.microsoft.com/office/drawing/2016/5/13/chartex" xmlns:cx8="http://schemas.microsoft.com/office/drawing/2016/5/14/chartex" xmlns:mc="http://schemas.openxmlformats.org/markup-compatibility/2006" xmlns:aink="http://schemas.microsoft.com/office/drawing/2016/ink" xmlns:am3d="http://schemas.microsoft.com/office/drawing/2017/model3d" xmlns:o="urn:schemas-microsoft-com:office:office" xmlns:oel="http://schemas.microsoft.com/office/2019/extlst" xmlns:r="http://schemas.openxmlformats.org/officeDocument/2006/relationships" xmlns:m="http://schemas.openxmlformats.org/officeDocument/2006/math" xmlns:v="urn:schemas-microsoft-com:vml" xmlns:wp14="http://schemas.microsoft.com/office/word/2010/wordprocessingDrawing" xmlns:wp="http://schemas.openxmlformats.org/drawingml/2006/wordprocessingDrawing" xmlns:w10="urn:schemas-microsoft-com:office:word" xmlns:w="http://schemas.openxmlformats.org/wordprocessingml/2006/main" xmlns:w14="http://schemas.microsoft.com/office/word/2010/wordml" xmlns:w15="http://schemas.microsoft.com/office/word/2012/wordml" xmlns:w16cei="http://schemas.microsoft.com/office/word/2026/wordml/cei" xmlns:w16cex="http://schemas.microsoft.com/office/word/2018/wordml/cex" xmlns:w16cid="http://schemas.microsoft.com/office/word/2016/wordml/cid" xmlns:w16="http://schemas.microsoft.com/office/word/2018/wordml" xmlns:w16du="http://schemas.microsoft.com/office/word/2023/wordml/word16du" xmlns:w16sdtdh="http://schemas.microsoft.com/office/word/2020/wordml/sdtdatahash" xmlns:w16sdtfl="http://schemas.microsoft.com/office/word/2024/wordml/sdtformatlock" xmlns:w16se="http://schemas.microsoft.com/office/word/2015/wordml/symex" xmlns:wpg="http://schemas.microsoft.com/office/word/2010/wordprocessingGroup" xmlns:wpi="http://schemas.microsoft.com/office/word/2010/wordprocessingInk" xmlns:wne="http://schemas.microsoft.com/office/word/2006/wordml" xmlns:wps="http://schemas.microsoft.com/office/word/2010/wordprocessingShape" mc:Ignorable="w14 w15 w16se w16cid w16 w16cex w16sdtdh w16sdtfl w16du wp14">
   <w:p>
     <w:pPr>
       <w:pBdr>
@@ -29914,7 +28626,7 @@
 </file>
 
 <file path=word/footer2.xml><?xml version="1.0" encoding="utf-8"?>
-<w:ftr xmlns:wpc="http://schemas.microsoft.com/office/word/2010/wordprocessingCanvas" xmlns:cx="http://schemas.microsoft.com/office/drawing/2014/chartex" xmlns:cx1="http://schemas.microsoft.com/office/drawing/2015/9/8/chartex" xmlns:cx2="http://schemas.microsoft.com/office/drawing/2015/10/21/chartex" xmlns:cx3="http://schemas.microsoft.com/office/drawing/2016/5/9/chartex" xmlns:cx4="http://schemas.microsoft.com/office/drawing/2016/5/10/chartex" xmlns:cx5="http://schemas.microsoft.com/office/drawing/2016/5/11/chartex" xmlns:cx6="http://schemas.microsoft.com/office/drawing/2016/5/12/chartex" xmlns:cx7="http://schemas.microsoft.com/office/drawing/2016/5/13/chartex" xmlns:cx8="http://schemas.microsoft.com/office/drawing/2016/5/14/chartex" xmlns:mc="http://schemas.openxmlformats.org/markup-compatibility/2006" xmlns:aink="http://schemas.microsoft.com/office/drawing/2016/ink" xmlns:am3d="http://schemas.microsoft.com/office/drawing/2017/model3d" xmlns:o="urn:schemas-microsoft-com:office:office" xmlns:oel="http://schemas.microsoft.com/office/2019/extlst" xmlns:r="http://schemas.openxmlformats.org/officeDocument/2006/relationships" xmlns:m="http://schemas.openxmlformats.org/officeDocument/2006/math" xmlns:v="urn:schemas-microsoft-com:vml" xmlns:wp14="http://schemas.microsoft.com/office/word/2010/wordprocessingDrawing" xmlns:wp="http://schemas.openxmlformats.org/drawingml/2006/wordprocessingDrawing" xmlns:w10="urn:schemas-microsoft-com:office:word" xmlns:w="http://schemas.openxmlformats.org/wordprocessingml/2006/main" xmlns:w14="http://schemas.microsoft.com/office/word/2010/wordml" xmlns:w15="http://schemas.microsoft.com/office/word/2012/wordml" xmlns:w16cex="http://schemas.microsoft.com/office/word/2018/wordml/cex" xmlns:w16cid="http://schemas.microsoft.com/office/word/2016/wordml/cid" xmlns:w16="http://schemas.microsoft.com/office/word/2018/wordml" xmlns:w16du="http://schemas.microsoft.com/office/word/2023/wordml/word16du" xmlns:w16sdtdh="http://schemas.microsoft.com/office/word/2020/wordml/sdtdatahash" xmlns:w16sdtfl="http://schemas.microsoft.com/office/word/2024/wordml/sdtformatlock" xmlns:w16se="http://schemas.microsoft.com/office/word/2015/wordml/symex" xmlns:wpg="http://schemas.microsoft.com/office/word/2010/wordprocessingGroup" xmlns:wpi="http://schemas.microsoft.com/office/word/2010/wordprocessingInk" xmlns:wne="http://schemas.microsoft.com/office/word/2006/wordml" xmlns:wps="http://schemas.microsoft.com/office/word/2010/wordprocessingShape" mc:Ignorable="w14 w15 w16se w16cid w16 w16cex w16sdtdh w16sdtfl w16du wp14">
+<w:ftr xmlns:wpc="http://schemas.microsoft.com/office/word/2010/wordprocessingCanvas" xmlns:cx="http://schemas.microsoft.com/office/drawing/2014/chartex" xmlns:cx1="http://schemas.microsoft.com/office/drawing/2015/9/8/chartex" xmlns:cx2="http://schemas.microsoft.com/office/drawing/2015/10/21/chartex" xmlns:cx3="http://schemas.microsoft.com/office/drawing/2016/5/9/chartex" xmlns:cx4="http://schemas.microsoft.com/office/drawing/2016/5/10/chartex" xmlns:cx5="http://schemas.microsoft.com/office/drawing/2016/5/11/chartex" xmlns:cx6="http://schemas.microsoft.com/office/drawing/2016/5/12/chartex" xmlns:cx7="http://schemas.microsoft.com/office/drawing/2016/5/13/chartex" xmlns:cx8="http://schemas.microsoft.com/office/drawing/2016/5/14/chartex" xmlns:mc="http://schemas.openxmlformats.org/markup-compatibility/2006" xmlns:aink="http://schemas.microsoft.com/office/drawing/2016/ink" xmlns:am3d="http://schemas.microsoft.com/office/drawing/2017/model3d" xmlns:o="urn:schemas-microsoft-com:office:office" xmlns:oel="http://schemas.microsoft.com/office/2019/extlst" xmlns:r="http://schemas.openxmlformats.org/officeDocument/2006/relationships" xmlns:m="http://schemas.openxmlformats.org/officeDocument/2006/math" xmlns:v="urn:schemas-microsoft-com:vml" xmlns:wp14="http://schemas.microsoft.com/office/word/2010/wordprocessingDrawing" xmlns:wp="http://schemas.openxmlformats.org/drawingml/2006/wordprocessingDrawing" xmlns:w10="urn:schemas-microsoft-com:office:word" xmlns:w="http://schemas.openxmlformats.org/wordprocessingml/2006/main" xmlns:w14="http://schemas.microsoft.com/office/word/2010/wordml" xmlns:w15="http://schemas.microsoft.com/office/word/2012/wordml" xmlns:w16cei="http://schemas.microsoft.com/office/word/2026/wordml/cei" xmlns:w16cex="http://schemas.microsoft.com/office/word/2018/wordml/cex" xmlns:w16cid="http://schemas.microsoft.com/office/word/2016/wordml/cid" xmlns:w16="http://schemas.microsoft.com/office/word/2018/wordml" xmlns:w16du="http://schemas.microsoft.com/office/word/2023/wordml/word16du" xmlns:w16sdtdh="http://schemas.microsoft.com/office/word/2020/wordml/sdtdatahash" xmlns:w16sdtfl="http://schemas.microsoft.com/office/word/2024/wordml/sdtformatlock" xmlns:w16se="http://schemas.microsoft.com/office/word/2015/wordml/symex" xmlns:wpg="http://schemas.microsoft.com/office/word/2010/wordprocessingGroup" xmlns:wpi="http://schemas.microsoft.com/office/word/2010/wordprocessingInk" xmlns:wne="http://schemas.microsoft.com/office/word/2006/wordml" xmlns:wps="http://schemas.microsoft.com/office/word/2010/wordprocessingShape" mc:Ignorable="w14 w15 w16se w16cid w16 w16cex w16sdtdh w16sdtfl w16du wp14">
   <w:p>
     <w:pPr>
       <w:pBdr>
@@ -30120,7 +28832,7 @@
 </file>
 
 <file path=word/footnotes.xml><?xml version="1.0" encoding="utf-8"?>
-<w:footnotes xmlns:wpc="http://schemas.microsoft.com/office/word/2010/wordprocessingCanvas" xmlns:cx="http://schemas.microsoft.com/office/drawing/2014/chartex" xmlns:cx1="http://schemas.microsoft.com/office/drawing/2015/9/8/chartex" xmlns:cx2="http://schemas.microsoft.com/office/drawing/2015/10/21/chartex" xmlns:cx3="http://schemas.microsoft.com/office/drawing/2016/5/9/chartex" xmlns:cx4="http://schemas.microsoft.com/office/drawing/2016/5/10/chartex" xmlns:cx5="http://schemas.microsoft.com/office/drawing/2016/5/11/chartex" xmlns:cx6="http://schemas.microsoft.com/office/drawing/2016/5/12/chartex" xmlns:cx7="http://schemas.microsoft.com/office/drawing/2016/5/13/chartex" xmlns:cx8="http://schemas.microsoft.com/office/drawing/2016/5/14/chartex" xmlns:mc="http://schemas.openxmlformats.org/markup-compatibility/2006" xmlns:aink="http://schemas.microsoft.com/office/drawing/2016/ink" xmlns:am3d="http://schemas.microsoft.com/office/drawing/2017/model3d" xmlns:o="urn:schemas-microsoft-com:office:office" xmlns:oel="http://schemas.microsoft.com/office/2019/extlst" xmlns:r="http://schemas.openxmlformats.org/officeDocument/2006/relationships" xmlns:m="http://schemas.openxmlformats.org/officeDocument/2006/math" xmlns:v="urn:schemas-microsoft-com:vml" xmlns:wp14="http://schemas.microsoft.com/office/word/2010/wordprocessingDrawing" xmlns:wp="http://schemas.openxmlformats.org/drawingml/2006/wordprocessingDrawing" xmlns:w10="urn:schemas-microsoft-com:office:word" xmlns:w="http://schemas.openxmlformats.org/wordprocessingml/2006/main" xmlns:w14="http://schemas.microsoft.com/office/word/2010/wordml" xmlns:w15="http://schemas.microsoft.com/office/word/2012/wordml" xmlns:w16cex="http://schemas.microsoft.com/office/word/2018/wordml/cex" xmlns:w16cid="http://schemas.microsoft.com/office/word/2016/wordml/cid" xmlns:w16="http://schemas.microsoft.com/office/word/2018/wordml" xmlns:w16du="http://schemas.microsoft.com/office/word/2023/wordml/word16du" xmlns:w16sdtdh="http://schemas.microsoft.com/office/word/2020/wordml/sdtdatahash" xmlns:w16sdtfl="http://schemas.microsoft.com/office/word/2024/wordml/sdtformatlock" xmlns:w16se="http://schemas.microsoft.com/office/word/2015/wordml/symex" xmlns:wpg="http://schemas.microsoft.com/office/word/2010/wordprocessingGroup" xmlns:wpi="http://schemas.microsoft.com/office/word/2010/wordprocessingInk" xmlns:wne="http://schemas.microsoft.com/office/word/2006/wordml" xmlns:wps="http://schemas.microsoft.com/office/word/2010/wordprocessingShape" mc:Ignorable="w14 w15 w16se w16cid w16 w16cex w16sdtdh w16sdtfl w16du wp14">
+<w:footnotes xmlns:wpc="http://schemas.microsoft.com/office/word/2010/wordprocessingCanvas" xmlns:cx="http://schemas.microsoft.com/office/drawing/2014/chartex" xmlns:cx1="http://schemas.microsoft.com/office/drawing/2015/9/8/chartex" xmlns:cx2="http://schemas.microsoft.com/office/drawing/2015/10/21/chartex" xmlns:cx3="http://schemas.microsoft.com/office/drawing/2016/5/9/chartex" xmlns:cx4="http://schemas.microsoft.com/office/drawing/2016/5/10/chartex" xmlns:cx5="http://schemas.microsoft.com/office/drawing/2016/5/11/chartex" xmlns:cx6="http://schemas.microsoft.com/office/drawing/2016/5/12/chartex" xmlns:cx7="http://schemas.microsoft.com/office/drawing/2016/5/13/chartex" xmlns:cx8="http://schemas.microsoft.com/office/drawing/2016/5/14/chartex" xmlns:mc="http://schemas.openxmlformats.org/markup-compatibility/2006" xmlns:aink="http://schemas.microsoft.com/office/drawing/2016/ink" xmlns:am3d="http://schemas.microsoft.com/office/drawing/2017/model3d" xmlns:o="urn:schemas-microsoft-com:office:office" xmlns:oel="http://schemas.microsoft.com/office/2019/extlst" xmlns:r="http://schemas.openxmlformats.org/officeDocument/2006/relationships" xmlns:m="http://schemas.openxmlformats.org/officeDocument/2006/math" xmlns:v="urn:schemas-microsoft-com:vml" xmlns:wp14="http://schemas.microsoft.com/office/word/2010/wordprocessingDrawing" xmlns:wp="http://schemas.openxmlformats.org/drawingml/2006/wordprocessingDrawing" xmlns:w10="urn:schemas-microsoft-com:office:word" xmlns:w="http://schemas.openxmlformats.org/wordprocessingml/2006/main" xmlns:w14="http://schemas.microsoft.com/office/word/2010/wordml" xmlns:w15="http://schemas.microsoft.com/office/word/2012/wordml" xmlns:w16cei="http://schemas.microsoft.com/office/word/2026/wordml/cei" xmlns:w16cex="http://schemas.microsoft.com/office/word/2018/wordml/cex" xmlns:w16cid="http://schemas.microsoft.com/office/word/2016/wordml/cid" xmlns:w16="http://schemas.microsoft.com/office/word/2018/wordml" xmlns:w16du="http://schemas.microsoft.com/office/word/2023/wordml/word16du" xmlns:w16sdtdh="http://schemas.microsoft.com/office/word/2020/wordml/sdtdatahash" xmlns:w16sdtfl="http://schemas.microsoft.com/office/word/2024/wordml/sdtformatlock" xmlns:w16se="http://schemas.microsoft.com/office/word/2015/wordml/symex" xmlns:wpg="http://schemas.microsoft.com/office/word/2010/wordprocessingGroup" xmlns:wpi="http://schemas.microsoft.com/office/word/2010/wordprocessingInk" xmlns:wne="http://schemas.microsoft.com/office/word/2006/wordml" xmlns:wps="http://schemas.microsoft.com/office/word/2010/wordprocessingShape" mc:Ignorable="w14 w15 w16se w16cid w16 w16cex w16sdtdh w16sdtfl w16du wp14">
   <w:footnote w:type="separator" w:id="-1">
     <w:p>
       <w:pPr>
@@ -30145,7 +28857,7 @@
 </file>
 
 <file path=word/header1.xml><?xml version="1.0" encoding="utf-8"?>
-<w:hdr xmlns:wpc="http://schemas.microsoft.com/office/word/2010/wordprocessingCanvas" xmlns:cx="http://schemas.microsoft.com/office/drawing/2014/chartex" xmlns:cx1="http://schemas.microsoft.com/office/drawing/2015/9/8/chartex" xmlns:cx2="http://schemas.microsoft.com/office/drawing/2015/10/21/chartex" xmlns:cx3="http://schemas.microsoft.com/office/drawing/2016/5/9/chartex" xmlns:cx4="http://schemas.microsoft.com/office/drawing/2016/5/10/chartex" xmlns:cx5="http://schemas.microsoft.com/office/drawing/2016/5/11/chartex" xmlns:cx6="http://schemas.microsoft.com/office/drawing/2016/5/12/chartex" xmlns:cx7="http://schemas.microsoft.com/office/drawing/2016/5/13/chartex" xmlns:cx8="http://schemas.microsoft.com/office/drawing/2016/5/14/chartex" xmlns:mc="http://schemas.openxmlformats.org/markup-compatibility/2006" xmlns:aink="http://schemas.microsoft.com/office/drawing/2016/ink" xmlns:am3d="http://schemas.microsoft.com/office/drawing/2017/model3d" xmlns:o="urn:schemas-microsoft-com:office:office" xmlns:oel="http://schemas.microsoft.com/office/2019/extlst" xmlns:r="http://schemas.openxmlformats.org/officeDocument/2006/relationships" xmlns:m="http://schemas.openxmlformats.org/officeDocument/2006/math" xmlns:v="urn:schemas-microsoft-com:vml" xmlns:wp14="http://schemas.microsoft.com/office/word/2010/wordprocessingDrawing" xmlns:wp="http://schemas.openxmlformats.org/drawingml/2006/wordprocessingDrawing" xmlns:w10="urn:schemas-microsoft-com:office:word" xmlns:w="http://schemas.openxmlformats.org/wordprocessingml/2006/main" xmlns:w14="http://schemas.microsoft.com/office/word/2010/wordml" xmlns:w15="http://schemas.microsoft.com/office/word/2012/wordml" xmlns:w16cex="http://schemas.microsoft.com/office/word/2018/wordml/cex" xmlns:w16cid="http://schemas.microsoft.com/office/word/2016/wordml/cid" xmlns:w16="http://schemas.microsoft.com/office/word/2018/wordml" xmlns:w16du="http://schemas.microsoft.com/office/word/2023/wordml/word16du" xmlns:w16sdtdh="http://schemas.microsoft.com/office/word/2020/wordml/sdtdatahash" xmlns:w16sdtfl="http://schemas.microsoft.com/office/word/2024/wordml/sdtformatlock" xmlns:w16se="http://schemas.microsoft.com/office/word/2015/wordml/symex" xmlns:wpg="http://schemas.microsoft.com/office/word/2010/wordprocessingGroup" xmlns:wpi="http://schemas.microsoft.com/office/word/2010/wordprocessingInk" xmlns:wne="http://schemas.microsoft.com/office/word/2006/wordml" xmlns:wps="http://schemas.microsoft.com/office/word/2010/wordprocessingShape" mc:Ignorable="w14 w15 w16se w16cid w16 w16cex w16sdtdh w16sdtfl w16du wp14">
+<w:hdr xmlns:wpc="http://schemas.microsoft.com/office/word/2010/wordprocessingCanvas" xmlns:cx="http://schemas.microsoft.com/office/drawing/2014/chartex" xmlns:cx1="http://schemas.microsoft.com/office/drawing/2015/9/8/chartex" xmlns:cx2="http://schemas.microsoft.com/office/drawing/2015/10/21/chartex" xmlns:cx3="http://schemas.microsoft.com/office/drawing/2016/5/9/chartex" xmlns:cx4="http://schemas.microsoft.com/office/drawing/2016/5/10/chartex" xmlns:cx5="http://schemas.microsoft.com/office/drawing/2016/5/11/chartex" xmlns:cx6="http://schemas.microsoft.com/office/drawing/2016/5/12/chartex" xmlns:cx7="http://schemas.microsoft.com/office/drawing/2016/5/13/chartex" xmlns:cx8="http://schemas.microsoft.com/office/drawing/2016/5/14/chartex" xmlns:mc="http://schemas.openxmlformats.org/markup-compatibility/2006" xmlns:aink="http://schemas.microsoft.com/office/drawing/2016/ink" xmlns:am3d="http://schemas.microsoft.com/office/drawing/2017/model3d" xmlns:o="urn:schemas-microsoft-com:office:office" xmlns:oel="http://schemas.microsoft.com/office/2019/extlst" xmlns:r="http://schemas.openxmlformats.org/officeDocument/2006/relationships" xmlns:m="http://schemas.openxmlformats.org/officeDocument/2006/math" xmlns:v="urn:schemas-microsoft-com:vml" xmlns:wp14="http://schemas.microsoft.com/office/word/2010/wordprocessingDrawing" xmlns:wp="http://schemas.openxmlformats.org/drawingml/2006/wordprocessingDrawing" xmlns:w10="urn:schemas-microsoft-com:office:word" xmlns:w="http://schemas.openxmlformats.org/wordprocessingml/2006/main" xmlns:w14="http://schemas.microsoft.com/office/word/2010/wordml" xmlns:w15="http://schemas.microsoft.com/office/word/2012/wordml" xmlns:w16cei="http://schemas.microsoft.com/office/word/2026/wordml/cei" xmlns:w16cex="http://schemas.microsoft.com/office/word/2018/wordml/cex" xmlns:w16cid="http://schemas.microsoft.com/office/word/2016/wordml/cid" xmlns:w16="http://schemas.microsoft.com/office/word/2018/wordml" xmlns:w16du="http://schemas.microsoft.com/office/word/2023/wordml/word16du" xmlns:w16sdtdh="http://schemas.microsoft.com/office/word/2020/wordml/sdtdatahash" xmlns:w16sdtfl="http://schemas.microsoft.com/office/word/2024/wordml/sdtformatlock" xmlns:w16se="http://schemas.microsoft.com/office/word/2015/wordml/symex" xmlns:wpg="http://schemas.microsoft.com/office/word/2010/wordprocessingGroup" xmlns:wpi="http://schemas.microsoft.com/office/word/2010/wordprocessingInk" xmlns:wne="http://schemas.microsoft.com/office/word/2006/wordml" xmlns:wps="http://schemas.microsoft.com/office/word/2010/wordprocessingShape" mc:Ignorable="w14 w15 w16se w16cid w16 w16cex w16sdtdh w16sdtfl w16du wp14">
   <w:p>
     <w:pPr>
       <w:pStyle w:val="Header"/>
@@ -30166,7 +28878,7 @@
 </file>
 
 <file path=word/header2.xml><?xml version="1.0" encoding="utf-8"?>
-<w:hdr xmlns:wpc="http://schemas.microsoft.com/office/word/2010/wordprocessingCanvas" xmlns:cx="http://schemas.microsoft.com/office/drawing/2014/chartex" xmlns:cx1="http://schemas.microsoft.com/office/drawing/2015/9/8/chartex" xmlns:cx2="http://schemas.microsoft.com/office/drawing/2015/10/21/chartex" xmlns:cx3="http://schemas.microsoft.com/office/drawing/2016/5/9/chartex" xmlns:cx4="http://schemas.microsoft.com/office/drawing/2016/5/10/chartex" xmlns:cx5="http://schemas.microsoft.com/office/drawing/2016/5/11/chartex" xmlns:cx6="http://schemas.microsoft.com/office/drawing/2016/5/12/chartex" xmlns:cx7="http://schemas.microsoft.com/office/drawing/2016/5/13/chartex" xmlns:cx8="http://schemas.microsoft.com/office/drawing/2016/5/14/chartex" xmlns:mc="http://schemas.openxmlformats.org/markup-compatibility/2006" xmlns:aink="http://schemas.microsoft.com/office/drawing/2016/ink" xmlns:am3d="http://schemas.microsoft.com/office/drawing/2017/model3d" xmlns:o="urn:schemas-microsoft-com:office:office" xmlns:oel="http://schemas.microsoft.com/office/2019/extlst" xmlns:r="http://schemas.openxmlformats.org/officeDocument/2006/relationships" xmlns:m="http://schemas.openxmlformats.org/officeDocument/2006/math" xmlns:v="urn:schemas-microsoft-com:vml" xmlns:wp14="http://schemas.microsoft.com/office/word/2010/wordprocessingDrawing" xmlns:wp="http://schemas.openxmlformats.org/drawingml/2006/wordprocessingDrawing" xmlns:w10="urn:schemas-microsoft-com:office:word" xmlns:w="http://schemas.openxmlformats.org/wordprocessingml/2006/main" xmlns:w14="http://schemas.microsoft.com/office/word/2010/wordml" xmlns:w15="http://schemas.microsoft.com/office/word/2012/wordml" xmlns:w16cex="http://schemas.microsoft.com/office/word/2018/wordml/cex" xmlns:w16cid="http://schemas.microsoft.com/office/word/2016/wordml/cid" xmlns:w16="http://schemas.microsoft.com/office/word/2018/wordml" xmlns:w16du="http://schemas.microsoft.com/office/word/2023/wordml/word16du" xmlns:w16sdtdh="http://schemas.microsoft.com/office/word/2020/wordml/sdtdatahash" xmlns:w16sdtfl="http://schemas.microsoft.com/office/word/2024/wordml/sdtformatlock" xmlns:w16se="http://schemas.microsoft.com/office/word/2015/wordml/symex" xmlns:wpg="http://schemas.microsoft.com/office/word/2010/wordprocessingGroup" xmlns:wpi="http://schemas.microsoft.com/office/word/2010/wordprocessingInk" xmlns:wne="http://schemas.microsoft.com/office/word/2006/wordml" xmlns:wps="http://schemas.microsoft.com/office/word/2010/wordprocessingShape" mc:Ignorable="w14 w15 w16se w16cid w16 w16cex w16sdtdh w16sdtfl w16du wp14">
+<w:hdr xmlns:wpc="http://schemas.microsoft.com/office/word/2010/wordprocessingCanvas" xmlns:cx="http://schemas.microsoft.com/office/drawing/2014/chartex" xmlns:cx1="http://schemas.microsoft.com/office/drawing/2015/9/8/chartex" xmlns:cx2="http://schemas.microsoft.com/office/drawing/2015/10/21/chartex" xmlns:cx3="http://schemas.microsoft.com/office/drawing/2016/5/9/chartex" xmlns:cx4="http://schemas.microsoft.com/office/drawing/2016/5/10/chartex" xmlns:cx5="http://schemas.microsoft.com/office/drawing/2016/5/11/chartex" xmlns:cx6="http://schemas.microsoft.com/office/drawing/2016/5/12/chartex" xmlns:cx7="http://schemas.microsoft.com/office/drawing/2016/5/13/chartex" xmlns:cx8="http://schemas.microsoft.com/office/drawing/2016/5/14/chartex" xmlns:mc="http://schemas.openxmlformats.org/markup-compatibility/2006" xmlns:aink="http://schemas.microsoft.com/office/drawing/2016/ink" xmlns:am3d="http://schemas.microsoft.com/office/drawing/2017/model3d" xmlns:o="urn:schemas-microsoft-com:office:office" xmlns:oel="http://schemas.microsoft.com/office/2019/extlst" xmlns:r="http://schemas.openxmlformats.org/officeDocument/2006/relationships" xmlns:m="http://schemas.openxmlformats.org/officeDocument/2006/math" xmlns:v="urn:schemas-microsoft-com:vml" xmlns:wp14="http://schemas.microsoft.com/office/word/2010/wordprocessingDrawing" xmlns:wp="http://schemas.openxmlformats.org/drawingml/2006/wordprocessingDrawing" xmlns:w10="urn:schemas-microsoft-com:office:word" xmlns:w="http://schemas.openxmlformats.org/wordprocessingml/2006/main" xmlns:w14="http://schemas.microsoft.com/office/word/2010/wordml" xmlns:w15="http://schemas.microsoft.com/office/word/2012/wordml" xmlns:w16cei="http://schemas.microsoft.com/office/word/2026/wordml/cei" xmlns:w16cex="http://schemas.microsoft.com/office/word/2018/wordml/cex" xmlns:w16cid="http://schemas.microsoft.com/office/word/2016/wordml/cid" xmlns:w16="http://schemas.microsoft.com/office/word/2018/wordml" xmlns:w16du="http://schemas.microsoft.com/office/word/2023/wordml/word16du" xmlns:w16sdtdh="http://schemas.microsoft.com/office/word/2020/wordml/sdtdatahash" xmlns:w16sdtfl="http://schemas.microsoft.com/office/word/2024/wordml/sdtformatlock" xmlns:w16se="http://schemas.microsoft.com/office/word/2015/wordml/symex" xmlns:wpg="http://schemas.microsoft.com/office/word/2010/wordprocessingGroup" xmlns:wpi="http://schemas.microsoft.com/office/word/2010/wordprocessingInk" xmlns:wne="http://schemas.microsoft.com/office/word/2006/wordml" xmlns:wps="http://schemas.microsoft.com/office/word/2010/wordprocessingShape" mc:Ignorable="w14 w15 w16se w16cid w16 w16cex w16sdtdh w16sdtfl w16du wp14">
   <w:p>
     <w:pPr>
       <w:pStyle w:val="Header"/>

</xml_diff>